<commit_message>
Implemented Low Level Design Plan and updated the doc
</commit_message>
<xml_diff>
--- a/docs/team_8_documentation.docx
+++ b/docs/team_8_documentation.docx
@@ -3,11 +3,76 @@
 <w:document xmlns:wpc="http://schemas.microsoft.com/office/word/2010/wordprocessingCanvas" xmlns:cx="http://schemas.microsoft.com/office/drawing/2014/chartex" xmlns:cx1="http://schemas.microsoft.com/office/drawing/2015/9/8/chartex" xmlns:cx2="http://schemas.microsoft.com/office/drawing/2015/10/21/chartex" xmlns:cx3="http://schemas.microsoft.com/office/drawing/2016/5/9/chartex" xmlns:cx4="http://schemas.microsoft.com/office/drawing/2016/5/10/chartex" xmlns:cx5="http://schemas.microsoft.com/office/drawing/2016/5/11/chartex" xmlns:cx6="http://schemas.microsoft.com/office/drawing/2016/5/12/chartex" xmlns:cx7="http://schemas.microsoft.com/office/drawing/2016/5/13/chartex" xmlns:cx8="http://schemas.microsoft.com/office/drawing/2016/5/14/chartex" xmlns:mc="http://schemas.openxmlformats.org/markup-compatibility/2006" xmlns:aink="http://schemas.microsoft.com/office/drawing/2016/ink" xmlns:am3d="http://schemas.microsoft.com/office/drawing/2017/model3d" xmlns:o="urn:schemas-microsoft-com:office:office" xmlns:oel="http://schemas.microsoft.com/office/2019/extlst" xmlns:r="http://schemas.openxmlformats.org/officeDocument/2006/relationships" xmlns:m="http://schemas.openxmlformats.org/officeDocument/2006/math" xmlns:v="urn:schemas-microsoft-com:vml" xmlns:wp14="http://schemas.microsoft.com/office/word/2010/wordprocessingDrawing" xmlns:wp="http://schemas.openxmlformats.org/drawingml/2006/wordprocessingDrawing" xmlns:w10="urn:schemas-microsoft-com:office:word" xmlns:w="http://schemas.openxmlformats.org/wordprocessingml/2006/main" xmlns:w14="http://schemas.microsoft.com/office/word/2010/wordml" xmlns:w15="http://schemas.microsoft.com/office/word/2012/wordml" xmlns:w16cex="http://schemas.microsoft.com/office/word/2018/wordml/cex" xmlns:w16cid="http://schemas.microsoft.com/office/word/2016/wordml/cid" xmlns:w16="http://schemas.microsoft.com/office/word/2018/wordml" xmlns:w16du="http://schemas.microsoft.com/office/word/2023/wordml/word16du" xmlns:w16sdtdh="http://schemas.microsoft.com/office/word/2020/wordml/sdtdatahash" xmlns:w16sdtfl="http://schemas.microsoft.com/office/word/2024/wordml/sdtformatlock" xmlns:w16se="http://schemas.microsoft.com/office/word/2015/wordml/symex" xmlns:wpg="http://schemas.microsoft.com/office/word/2010/wordprocessingGroup" xmlns:wpi="http://schemas.microsoft.com/office/word/2010/wordprocessingInk" xmlns:wne="http://schemas.microsoft.com/office/word/2006/wordml" xmlns:wps="http://schemas.microsoft.com/office/word/2010/wordprocessingShape" mc:Ignorable="w14 w15 w16se w16cid w16 w16cex w16sdtdh w16sdtfl w16du wp14">
   <w:body>
     <w:p>
-      <w:r>
+      <w:pPr>
+        <w:rPr>
+          <w:b/>
+          <w:color w:val="F6C5AC" w:themeColor="accent2" w:themeTint="66"/>
+          <w:sz w:val="40"/>
+          <w:szCs w:val="40"/>
+          <w14:textOutline w14:w="11112" w14:cap="flat" w14:cmpd="sng" w14:algn="ctr">
+            <w14:solidFill>
+              <w14:schemeClr w14:val="accent2"/>
+            </w14:solidFill>
+            <w14:prstDash w14:val="solid"/>
+            <w14:round/>
+          </w14:textOutline>
+        </w:rPr>
+      </w:pPr>
+      <w:r>
+        <w:rPr>
+          <w:b/>
+          <w:color w:val="F6C5AC" w:themeColor="accent2" w:themeTint="66"/>
+          <w:sz w:val="40"/>
+          <w:szCs w:val="40"/>
+          <w14:textOutline w14:w="11112" w14:cap="flat" w14:cmpd="sng" w14:algn="ctr">
+            <w14:solidFill>
+              <w14:schemeClr w14:val="accent2"/>
+            </w14:solidFill>
+            <w14:prstDash w14:val="solid"/>
+            <w14:round/>
+          </w14:textOutline>
+        </w:rPr>
         <w:t>SALESTORM</w:t>
       </w:r>
     </w:p>
     <w:p>
+      <w:pPr>
+        <w:rPr>
+          <w:color w:val="000000" w:themeColor="text1"/>
+          <w:sz w:val="24"/>
+          <w:szCs w:val="24"/>
+          <w14:shadow w14:blurRad="38100" w14:dist="19050" w14:dir="2700000" w14:sx="100000" w14:sy="100000" w14:kx="0" w14:ky="0" w14:algn="tl">
+            <w14:schemeClr w14:val="dk1">
+              <w14:alpha w14:val="60000"/>
+            </w14:schemeClr>
+          </w14:shadow>
+          <w14:textOutline w14:w="0" w14:cap="flat" w14:cmpd="sng" w14:algn="ctr">
+            <w14:noFill/>
+            <w14:prstDash w14:val="solid"/>
+            <w14:round/>
+          </w14:textOutline>
+        </w:rPr>
+      </w:pPr>
+      <w:r>
+        <w:rPr>
+          <w:color w:val="000000" w:themeColor="text1"/>
+          <w:sz w:val="24"/>
+          <w:szCs w:val="24"/>
+          <w14:shadow w14:blurRad="38100" w14:dist="19050" w14:dir="2700000" w14:sx="100000" w14:sy="100000" w14:kx="0" w14:ky="0" w14:algn="tl">
+            <w14:schemeClr w14:val="dk1">
+              <w14:alpha w14:val="60000"/>
+            </w14:schemeClr>
+          </w14:shadow>
+          <w14:textOutline w14:w="0" w14:cap="flat" w14:cmpd="sng" w14:algn="ctr">
+            <w14:noFill/>
+            <w14:prstDash w14:val="solid"/>
+            <w14:round/>
+          </w14:textOutline>
+        </w:rPr>
+        <w:t>HLD</w:t>
+      </w:r>
+    </w:p>
+    <w:p>
       <w:r>
         <w:rPr>
           <w:b/>
@@ -196,17 +261,17 @@
     </w:p>
     <w:p>
       <w:r>
+        <w:t>19.   System should be able to initiate a payment</w:t>
+      </w:r>
+    </w:p>
+    <w:p>
+      <w:r>
+        <w:t>20.   Should be able to handle the successful payment</w:t>
+      </w:r>
+    </w:p>
+    <w:p>
+      <w:r>
         <w:lastRenderedPageBreak/>
-        <w:t>19.   System should be able to initiate a payment</w:t>
-      </w:r>
-    </w:p>
-    <w:p>
-      <w:r>
-        <w:t>20.   Should be able to handle the successful payment</w:t>
-      </w:r>
-    </w:p>
-    <w:p>
-      <w:r>
         <w:t xml:space="preserve">21.   Should be able </w:t>
       </w:r>
       <w:proofErr w:type="spellStart"/>
@@ -322,7 +387,6 @@
     </w:p>
     <w:p>
       <w:r>
-        <w:lastRenderedPageBreak/>
         <w:t>                           -&gt; During flash sale or high traffic period, the latency must be controlled</w:t>
       </w:r>
     </w:p>
@@ -371,6 +435,7 @@
     </w:p>
     <w:p>
       <w:r>
+        <w:lastRenderedPageBreak/>
         <w:t>4. Idempotency: -&gt; The duplicate purchase requests must be safe i.e., the system should not create multiple reservations/orders on duplicate requests</w:t>
       </w:r>
     </w:p>
@@ -441,7 +506,6 @@
     </w:p>
     <w:p>
       <w:r>
-        <w:lastRenderedPageBreak/>
         <w:t>                 -&gt; Input validation</w:t>
       </w:r>
     </w:p>
@@ -503,6 +567,7 @@
           <w:i/>
           <w:iCs/>
         </w:rPr>
+        <w:lastRenderedPageBreak/>
         <w:t>Inventory reservation failures</w:t>
       </w:r>
     </w:p>
@@ -581,7 +646,6 @@
           <w:b/>
           <w:bCs/>
         </w:rPr>
-        <w:lastRenderedPageBreak/>
         <w:t>System architecture</w:t>
       </w:r>
     </w:p>
@@ -600,6 +664,7 @@
           <w:bCs/>
           <w:noProof/>
         </w:rPr>
+        <w:lastRenderedPageBreak/>
         <w:drawing>
           <wp:inline distT="0" distB="0" distL="0" distR="0" wp14:anchorId="7EAB87BC" wp14:editId="035E1DE0">
             <wp:extent cx="8790709" cy="3389283"/>
@@ -718,22 +783,22 @@
           <w:sz w:val="24"/>
           <w:szCs w:val="24"/>
         </w:rPr>
+        <w:t>Context Diagram</w:t>
+      </w:r>
+    </w:p>
+    <w:p>
+      <w:pPr>
+        <w:rPr>
+          <w:b/>
+          <w:bCs/>
+        </w:rPr>
+      </w:pPr>
+      <w:r>
+        <w:rPr>
+          <w:b/>
+          <w:bCs/>
+        </w:rPr>
         <w:lastRenderedPageBreak/>
-        <w:t>Context Diagram</w:t>
-      </w:r>
-    </w:p>
-    <w:p>
-      <w:pPr>
-        <w:rPr>
-          <w:b/>
-          <w:bCs/>
-        </w:rPr>
-      </w:pPr>
-      <w:r>
-        <w:rPr>
-          <w:b/>
-          <w:bCs/>
-        </w:rPr>
         <w:br/>
       </w:r>
       <w:r>
@@ -821,14 +886,7 @@
           <w:b/>
           <w:bCs/>
         </w:rPr>
-        <w:t xml:space="preserve"> </w:t>
-      </w:r>
-      <w:r>
-        <w:rPr>
-          <w:b/>
-          <w:bCs/>
-        </w:rPr>
-        <w:t>Diagra</w:t>
+        <w:t xml:space="preserve"> Diagra</w:t>
       </w:r>
       <w:r>
         <w:rPr>
@@ -912,20 +970,6 @@
       <w:r>
         <w:tab/>
       </w:r>
-    </w:p>
-    <w:p>
-      <w:pPr>
-        <w:tabs>
-          <w:tab w:val="left" w:pos="6284"/>
-        </w:tabs>
-      </w:pPr>
-    </w:p>
-    <w:p>
-      <w:pPr>
-        <w:tabs>
-          <w:tab w:val="left" w:pos="6284"/>
-        </w:tabs>
-      </w:pPr>
     </w:p>
     <w:p>
       <w:pPr>
@@ -1022,7 +1066,6 @@
           <w:b/>
           <w:bCs/>
         </w:rPr>
-        <w:lastRenderedPageBreak/>
         <w:t>Architecture Decision Record (ADR)</w:t>
       </w:r>
     </w:p>
@@ -1134,6 +1177,7 @@
           </w:tcPr>
           <w:p>
             <w:r>
+              <w:lastRenderedPageBreak/>
               <w:t>ADR-002</w:t>
             </w:r>
           </w:p>
@@ -1536,7 +1580,6 @@
           </w:tcPr>
           <w:p>
             <w:r>
-              <w:lastRenderedPageBreak/>
               <w:t>Payment</w:t>
             </w:r>
           </w:p>
@@ -1664,6 +1707,7 @@
           <w:b/>
           <w:bCs/>
         </w:rPr>
+        <w:lastRenderedPageBreak/>
         <w:t>Flow</w:t>
       </w:r>
     </w:p>
@@ -1790,7 +1834,6 @@
         </w:numPr>
       </w:pPr>
       <w:r>
-        <w:lastRenderedPageBreak/>
         <w:t>Can retry create duplicate payment?</w:t>
       </w:r>
     </w:p>
@@ -1908,6 +1951,7 @@
         </w:numPr>
       </w:pPr>
       <w:r>
+        <w:lastRenderedPageBreak/>
         <w:t>Are database ownership boundaries respected?</w:t>
       </w:r>
     </w:p>
@@ -1962,9 +2006,2446 @@
     <w:p/>
     <w:p/>
     <w:p/>
+    <w:p/>
+    <w:p/>
+    <w:p/>
+    <w:p/>
+    <w:p/>
+    <w:p/>
+    <w:p/>
+    <w:p/>
+    <w:p/>
+    <w:p>
+      <w:pPr>
+        <w:rPr>
+          <w:b/>
+          <w:bCs/>
+          <w:sz w:val="40"/>
+          <w:szCs w:val="40"/>
+        </w:rPr>
+      </w:pPr>
+      <w:r>
+        <w:lastRenderedPageBreak/>
+        <w:t xml:space="preserve">                                                                                                                                </w:t>
+      </w:r>
+      <w:r>
+        <w:rPr>
+          <w:b/>
+          <w:bCs/>
+          <w:sz w:val="40"/>
+          <w:szCs w:val="40"/>
+        </w:rPr>
+        <w:t>LLD</w:t>
+      </w:r>
+    </w:p>
+    <w:p/>
+    <w:p>
+      <w:pPr>
+        <w:rPr>
+          <w:sz w:val="36"/>
+          <w:szCs w:val="36"/>
+        </w:rPr>
+      </w:pPr>
+      <w:r>
+        <w:rPr>
+          <w:sz w:val="36"/>
+          <w:szCs w:val="36"/>
+        </w:rPr>
+        <w:t>Class Diagrams</w:t>
+      </w:r>
+      <w:r>
+        <w:rPr>
+          <w:sz w:val="36"/>
+          <w:szCs w:val="36"/>
+        </w:rPr>
+        <w:t>:</w:t>
+      </w:r>
+    </w:p>
+    <w:p>
+      <w:pPr>
+        <w:rPr>
+          <w:sz w:val="36"/>
+          <w:szCs w:val="36"/>
+        </w:rPr>
+      </w:pPr>
+      <w:r>
+        <w:rPr>
+          <w:sz w:val="30"/>
+          <w:szCs w:val="30"/>
+        </w:rPr>
+        <w:t>Inventory Class Diagra</w:t>
+      </w:r>
+      <w:r>
+        <w:rPr>
+          <w:sz w:val="30"/>
+          <w:szCs w:val="30"/>
+        </w:rPr>
+        <w:t xml:space="preserve">m </w:t>
+      </w:r>
+    </w:p>
+    <w:p>
+      <w:pPr>
+        <w:rPr>
+          <w:sz w:val="30"/>
+          <w:szCs w:val="30"/>
+        </w:rPr>
+      </w:pPr>
+      <w:r>
+        <w:rPr>
+          <w:sz w:val="30"/>
+          <w:szCs w:val="30"/>
+        </w:rPr>
+        <w:drawing>
+          <wp:inline distT="0" distB="0" distL="0" distR="0" wp14:anchorId="20BE2EB5" wp14:editId="3B12A04F">
+            <wp:extent cx="4222186" cy="4328160"/>
+            <wp:effectExtent l="0" t="0" r="6985" b="0"/>
+            <wp:docPr id="1800907412" name="Picture 1"/>
+            <wp:cNvGraphicFramePr>
+              <a:graphicFrameLocks xmlns:a="http://schemas.openxmlformats.org/drawingml/2006/main" noChangeAspect="1"/>
+            </wp:cNvGraphicFramePr>
+            <a:graphic xmlns:a="http://schemas.openxmlformats.org/drawingml/2006/main">
+              <a:graphicData uri="http://schemas.openxmlformats.org/drawingml/2006/picture">
+                <pic:pic xmlns:pic="http://schemas.openxmlformats.org/drawingml/2006/picture">
+                  <pic:nvPicPr>
+                    <pic:cNvPr id="1800907412" name=""/>
+                    <pic:cNvPicPr/>
+                  </pic:nvPicPr>
+                  <pic:blipFill>
+                    <a:blip r:embed="rId11"/>
+                    <a:stretch>
+                      <a:fillRect/>
+                    </a:stretch>
+                  </pic:blipFill>
+                  <pic:spPr>
+                    <a:xfrm>
+                      <a:off x="0" y="0"/>
+                      <a:ext cx="4226394" cy="4332474"/>
+                    </a:xfrm>
+                    <a:prstGeom prst="rect">
+                      <a:avLst/>
+                    </a:prstGeom>
+                  </pic:spPr>
+                </pic:pic>
+              </a:graphicData>
+            </a:graphic>
+          </wp:inline>
+        </w:drawing>
+      </w:r>
+    </w:p>
+    <w:p>
+      <w:pPr>
+        <w:rPr>
+          <w:sz w:val="30"/>
+          <w:szCs w:val="30"/>
+        </w:rPr>
+      </w:pPr>
+    </w:p>
+    <w:p>
+      <w:pPr>
+        <w:rPr>
+          <w:sz w:val="30"/>
+          <w:szCs w:val="30"/>
+        </w:rPr>
+      </w:pPr>
+    </w:p>
+    <w:p>
+      <w:pPr>
+        <w:rPr>
+          <w:sz w:val="30"/>
+          <w:szCs w:val="30"/>
+        </w:rPr>
+      </w:pPr>
+      <w:r>
+        <w:rPr>
+          <w:sz w:val="30"/>
+          <w:szCs w:val="30"/>
+        </w:rPr>
+        <w:lastRenderedPageBreak/>
+        <w:t>Payment Class Diagram</w:t>
+      </w:r>
+    </w:p>
+    <w:p>
+      <w:pPr>
+        <w:rPr>
+          <w:sz w:val="30"/>
+          <w:szCs w:val="30"/>
+        </w:rPr>
+      </w:pPr>
+    </w:p>
+    <w:p>
+      <w:pPr>
+        <w:rPr>
+          <w:sz w:val="30"/>
+          <w:szCs w:val="30"/>
+        </w:rPr>
+      </w:pPr>
+    </w:p>
+    <w:p>
+      <w:pPr>
+        <w:rPr>
+          <w:sz w:val="30"/>
+          <w:szCs w:val="30"/>
+        </w:rPr>
+      </w:pPr>
+      <w:r>
+        <w:rPr>
+          <w:sz w:val="30"/>
+          <w:szCs w:val="30"/>
+        </w:rPr>
+        <w:drawing>
+          <wp:inline distT="0" distB="0" distL="0" distR="0" wp14:anchorId="5A77E1BB" wp14:editId="72E5541A">
+            <wp:extent cx="5146478" cy="4846320"/>
+            <wp:effectExtent l="0" t="0" r="0" b="0"/>
+            <wp:docPr id="1059940258" name="Picture 1"/>
+            <wp:cNvGraphicFramePr>
+              <a:graphicFrameLocks xmlns:a="http://schemas.openxmlformats.org/drawingml/2006/main" noChangeAspect="1"/>
+            </wp:cNvGraphicFramePr>
+            <a:graphic xmlns:a="http://schemas.openxmlformats.org/drawingml/2006/main">
+              <a:graphicData uri="http://schemas.openxmlformats.org/drawingml/2006/picture">
+                <pic:pic xmlns:pic="http://schemas.openxmlformats.org/drawingml/2006/picture">
+                  <pic:nvPicPr>
+                    <pic:cNvPr id="1059940258" name=""/>
+                    <pic:cNvPicPr/>
+                  </pic:nvPicPr>
+                  <pic:blipFill>
+                    <a:blip r:embed="rId12"/>
+                    <a:stretch>
+                      <a:fillRect/>
+                    </a:stretch>
+                  </pic:blipFill>
+                  <pic:spPr>
+                    <a:xfrm>
+                      <a:off x="0" y="0"/>
+                      <a:ext cx="5149044" cy="4848737"/>
+                    </a:xfrm>
+                    <a:prstGeom prst="rect">
+                      <a:avLst/>
+                    </a:prstGeom>
+                  </pic:spPr>
+                </pic:pic>
+              </a:graphicData>
+            </a:graphic>
+          </wp:inline>
+        </w:drawing>
+      </w:r>
+    </w:p>
+    <w:p>
+      <w:pPr>
+        <w:rPr>
+          <w:sz w:val="30"/>
+          <w:szCs w:val="30"/>
+        </w:rPr>
+      </w:pPr>
+    </w:p>
+    <w:p>
+      <w:pPr>
+        <w:rPr>
+          <w:sz w:val="30"/>
+          <w:szCs w:val="30"/>
+        </w:rPr>
+      </w:pPr>
+    </w:p>
+    <w:p>
+      <w:pPr>
+        <w:rPr>
+          <w:sz w:val="30"/>
+          <w:szCs w:val="30"/>
+        </w:rPr>
+      </w:pPr>
+      <w:r>
+        <w:rPr>
+          <w:sz w:val="30"/>
+          <w:szCs w:val="30"/>
+        </w:rPr>
+        <w:lastRenderedPageBreak/>
+        <w:t>Order Class Diagram</w:t>
+      </w:r>
+    </w:p>
+    <w:p>
+      <w:pPr>
+        <w:rPr>
+          <w:sz w:val="30"/>
+          <w:szCs w:val="30"/>
+        </w:rPr>
+      </w:pPr>
+    </w:p>
+    <w:p>
+      <w:pPr>
+        <w:rPr>
+          <w:sz w:val="30"/>
+          <w:szCs w:val="30"/>
+        </w:rPr>
+      </w:pPr>
+      <w:r>
+        <w:rPr>
+          <w:sz w:val="30"/>
+          <w:szCs w:val="30"/>
+        </w:rPr>
+        <w:drawing>
+          <wp:inline distT="0" distB="0" distL="0" distR="0" wp14:anchorId="4FD0E673" wp14:editId="1C25B920">
+            <wp:extent cx="3292125" cy="5791702"/>
+            <wp:effectExtent l="0" t="0" r="3810" b="0"/>
+            <wp:docPr id="1369649344" name="Picture 1"/>
+            <wp:cNvGraphicFramePr>
+              <a:graphicFrameLocks xmlns:a="http://schemas.openxmlformats.org/drawingml/2006/main" noChangeAspect="1"/>
+            </wp:cNvGraphicFramePr>
+            <a:graphic xmlns:a="http://schemas.openxmlformats.org/drawingml/2006/main">
+              <a:graphicData uri="http://schemas.openxmlformats.org/drawingml/2006/picture">
+                <pic:pic xmlns:pic="http://schemas.openxmlformats.org/drawingml/2006/picture">
+                  <pic:nvPicPr>
+                    <pic:cNvPr id="1369649344" name=""/>
+                    <pic:cNvPicPr/>
+                  </pic:nvPicPr>
+                  <pic:blipFill>
+                    <a:blip r:embed="rId13"/>
+                    <a:stretch>
+                      <a:fillRect/>
+                    </a:stretch>
+                  </pic:blipFill>
+                  <pic:spPr>
+                    <a:xfrm>
+                      <a:off x="0" y="0"/>
+                      <a:ext cx="3292125" cy="5791702"/>
+                    </a:xfrm>
+                    <a:prstGeom prst="rect">
+                      <a:avLst/>
+                    </a:prstGeom>
+                  </pic:spPr>
+                </pic:pic>
+              </a:graphicData>
+            </a:graphic>
+          </wp:inline>
+        </w:drawing>
+      </w:r>
+    </w:p>
+    <w:p>
+      <w:pPr>
+        <w:rPr>
+          <w:sz w:val="40"/>
+          <w:szCs w:val="40"/>
+        </w:rPr>
+      </w:pPr>
+      <w:r>
+        <w:rPr>
+          <w:sz w:val="40"/>
+          <w:szCs w:val="40"/>
+        </w:rPr>
+        <w:lastRenderedPageBreak/>
+        <w:t xml:space="preserve">                                                                  </w:t>
+      </w:r>
+      <w:r>
+        <w:rPr>
+          <w:b/>
+          <w:bCs/>
+          <w:sz w:val="40"/>
+          <w:szCs w:val="40"/>
+        </w:rPr>
+        <w:t>Sequence Diagrams</w:t>
+      </w:r>
+    </w:p>
+    <w:p>
+      <w:pPr>
+        <w:rPr>
+          <w:sz w:val="30"/>
+          <w:szCs w:val="30"/>
+        </w:rPr>
+      </w:pPr>
+      <w:r>
+        <w:rPr>
+          <w:sz w:val="30"/>
+          <w:szCs w:val="30"/>
+        </w:rPr>
+        <w:t>Purchase / Reservation Sequence</w:t>
+      </w:r>
+    </w:p>
+    <w:p>
+      <w:pPr>
+        <w:rPr>
+          <w:sz w:val="30"/>
+          <w:szCs w:val="30"/>
+        </w:rPr>
+      </w:pPr>
+      <w:r>
+        <w:rPr>
+          <w:sz w:val="30"/>
+          <w:szCs w:val="30"/>
+        </w:rPr>
+        <w:drawing>
+          <wp:inline distT="0" distB="0" distL="0" distR="0" wp14:anchorId="4E568F0E" wp14:editId="767C11FF">
+            <wp:extent cx="5204460" cy="5683819"/>
+            <wp:effectExtent l="0" t="0" r="0" b="0"/>
+            <wp:docPr id="1282271597" name="Picture 1"/>
+            <wp:cNvGraphicFramePr>
+              <a:graphicFrameLocks xmlns:a="http://schemas.openxmlformats.org/drawingml/2006/main" noChangeAspect="1"/>
+            </wp:cNvGraphicFramePr>
+            <a:graphic xmlns:a="http://schemas.openxmlformats.org/drawingml/2006/main">
+              <a:graphicData uri="http://schemas.openxmlformats.org/drawingml/2006/picture">
+                <pic:pic xmlns:pic="http://schemas.openxmlformats.org/drawingml/2006/picture">
+                  <pic:nvPicPr>
+                    <pic:cNvPr id="1282271597" name=""/>
+                    <pic:cNvPicPr/>
+                  </pic:nvPicPr>
+                  <pic:blipFill>
+                    <a:blip r:embed="rId14"/>
+                    <a:stretch>
+                      <a:fillRect/>
+                    </a:stretch>
+                  </pic:blipFill>
+                  <pic:spPr>
+                    <a:xfrm>
+                      <a:off x="0" y="0"/>
+                      <a:ext cx="5211639" cy="5691659"/>
+                    </a:xfrm>
+                    <a:prstGeom prst="rect">
+                      <a:avLst/>
+                    </a:prstGeom>
+                  </pic:spPr>
+                </pic:pic>
+              </a:graphicData>
+            </a:graphic>
+          </wp:inline>
+        </w:drawing>
+      </w:r>
+    </w:p>
+    <w:p>
+      <w:pPr>
+        <w:rPr>
+          <w:sz w:val="30"/>
+          <w:szCs w:val="30"/>
+        </w:rPr>
+      </w:pPr>
+      <w:r>
+        <w:rPr>
+          <w:sz w:val="30"/>
+          <w:szCs w:val="30"/>
+        </w:rPr>
+        <w:lastRenderedPageBreak/>
+        <w:t>Payment Sequence</w:t>
+      </w:r>
+    </w:p>
+    <w:p>
+      <w:pPr>
+        <w:rPr>
+          <w:sz w:val="30"/>
+          <w:szCs w:val="30"/>
+        </w:rPr>
+      </w:pPr>
+      <w:r>
+        <w:rPr>
+          <w:sz w:val="30"/>
+          <w:szCs w:val="30"/>
+        </w:rPr>
+        <w:drawing>
+          <wp:inline distT="0" distB="0" distL="0" distR="0" wp14:anchorId="7BCD3526" wp14:editId="0A7CF9D4">
+            <wp:extent cx="4282811" cy="5753599"/>
+            <wp:effectExtent l="0" t="0" r="3810" b="0"/>
+            <wp:docPr id="90971864" name="Picture 1"/>
+            <wp:cNvGraphicFramePr>
+              <a:graphicFrameLocks xmlns:a="http://schemas.openxmlformats.org/drawingml/2006/main" noChangeAspect="1"/>
+            </wp:cNvGraphicFramePr>
+            <a:graphic xmlns:a="http://schemas.openxmlformats.org/drawingml/2006/main">
+              <a:graphicData uri="http://schemas.openxmlformats.org/drawingml/2006/picture">
+                <pic:pic xmlns:pic="http://schemas.openxmlformats.org/drawingml/2006/picture">
+                  <pic:nvPicPr>
+                    <pic:cNvPr id="90971864" name=""/>
+                    <pic:cNvPicPr/>
+                  </pic:nvPicPr>
+                  <pic:blipFill>
+                    <a:blip r:embed="rId15"/>
+                    <a:stretch>
+                      <a:fillRect/>
+                    </a:stretch>
+                  </pic:blipFill>
+                  <pic:spPr>
+                    <a:xfrm>
+                      <a:off x="0" y="0"/>
+                      <a:ext cx="4282811" cy="5753599"/>
+                    </a:xfrm>
+                    <a:prstGeom prst="rect">
+                      <a:avLst/>
+                    </a:prstGeom>
+                  </pic:spPr>
+                </pic:pic>
+              </a:graphicData>
+            </a:graphic>
+          </wp:inline>
+        </w:drawing>
+      </w:r>
+    </w:p>
+    <w:p>
+      <w:pPr>
+        <w:rPr>
+          <w:sz w:val="30"/>
+          <w:szCs w:val="30"/>
+        </w:rPr>
+      </w:pPr>
+    </w:p>
+    <w:p>
+      <w:pPr>
+        <w:rPr>
+          <w:sz w:val="30"/>
+          <w:szCs w:val="30"/>
+        </w:rPr>
+      </w:pPr>
+      <w:r>
+        <w:rPr>
+          <w:sz w:val="30"/>
+          <w:szCs w:val="30"/>
+        </w:rPr>
+        <w:lastRenderedPageBreak/>
+        <w:t>Order Creation + Recovery Sequence</w:t>
+      </w:r>
+    </w:p>
+    <w:p>
+      <w:pPr>
+        <w:rPr>
+          <w:sz w:val="30"/>
+          <w:szCs w:val="30"/>
+        </w:rPr>
+      </w:pPr>
+      <w:r>
+        <w:rPr>
+          <w:sz w:val="30"/>
+          <w:szCs w:val="30"/>
+        </w:rPr>
+        <w:drawing>
+          <wp:inline distT="0" distB="0" distL="0" distR="0" wp14:anchorId="68D5DF39" wp14:editId="6FE16E49">
+            <wp:extent cx="5265876" cy="5121084"/>
+            <wp:effectExtent l="0" t="0" r="0" b="3810"/>
+            <wp:docPr id="656991047" name="Picture 1"/>
+            <wp:cNvGraphicFramePr>
+              <a:graphicFrameLocks xmlns:a="http://schemas.openxmlformats.org/drawingml/2006/main" noChangeAspect="1"/>
+            </wp:cNvGraphicFramePr>
+            <a:graphic xmlns:a="http://schemas.openxmlformats.org/drawingml/2006/main">
+              <a:graphicData uri="http://schemas.openxmlformats.org/drawingml/2006/picture">
+                <pic:pic xmlns:pic="http://schemas.openxmlformats.org/drawingml/2006/picture">
+                  <pic:nvPicPr>
+                    <pic:cNvPr id="656991047" name=""/>
+                    <pic:cNvPicPr/>
+                  </pic:nvPicPr>
+                  <pic:blipFill>
+                    <a:blip r:embed="rId16"/>
+                    <a:stretch>
+                      <a:fillRect/>
+                    </a:stretch>
+                  </pic:blipFill>
+                  <pic:spPr>
+                    <a:xfrm>
+                      <a:off x="0" y="0"/>
+                      <a:ext cx="5265876" cy="5121084"/>
+                    </a:xfrm>
+                    <a:prstGeom prst="rect">
+                      <a:avLst/>
+                    </a:prstGeom>
+                  </pic:spPr>
+                </pic:pic>
+              </a:graphicData>
+            </a:graphic>
+          </wp:inline>
+        </w:drawing>
+      </w:r>
+    </w:p>
+    <w:p>
+      <w:pPr>
+        <w:rPr>
+          <w:sz w:val="30"/>
+          <w:szCs w:val="30"/>
+        </w:rPr>
+      </w:pPr>
+    </w:p>
+    <w:p>
+      <w:pPr>
+        <w:rPr>
+          <w:sz w:val="30"/>
+          <w:szCs w:val="30"/>
+        </w:rPr>
+      </w:pPr>
+    </w:p>
+    <w:p>
+      <w:pPr>
+        <w:rPr>
+          <w:sz w:val="30"/>
+          <w:szCs w:val="30"/>
+        </w:rPr>
+      </w:pPr>
+    </w:p>
+    <w:p>
+      <w:pPr>
+        <w:rPr>
+          <w:b/>
+          <w:bCs/>
+          <w:sz w:val="30"/>
+          <w:szCs w:val="30"/>
+        </w:rPr>
+      </w:pPr>
+      <w:r>
+        <w:rPr>
+          <w:b/>
+          <w:bCs/>
+          <w:sz w:val="30"/>
+          <w:szCs w:val="30"/>
+        </w:rPr>
+        <w:lastRenderedPageBreak/>
+        <w:t>SALESTORM — SOLID Mapping</w:t>
+      </w:r>
+    </w:p>
+    <w:p>
+      <w:pPr>
+        <w:rPr>
+          <w:b/>
+          <w:bCs/>
+          <w:sz w:val="30"/>
+          <w:szCs w:val="30"/>
+        </w:rPr>
+      </w:pPr>
+      <w:r>
+        <w:rPr>
+          <w:b/>
+          <w:bCs/>
+          <w:sz w:val="30"/>
+          <w:szCs w:val="30"/>
+        </w:rPr>
+        <w:t>1. Single Responsibility Principle (SRP)</w:t>
+      </w:r>
+    </w:p>
+    <w:p>
+      <w:pPr>
+        <w:rPr>
+          <w:sz w:val="30"/>
+          <w:szCs w:val="30"/>
+        </w:rPr>
+      </w:pPr>
+      <w:proofErr w:type="spellStart"/>
+      <w:r>
+        <w:rPr>
+          <w:sz w:val="30"/>
+          <w:szCs w:val="30"/>
+        </w:rPr>
+        <w:t>ClassResponsibilityPaymentServiceHandles</w:t>
+      </w:r>
+      <w:proofErr w:type="spellEnd"/>
+      <w:r>
+        <w:rPr>
+          <w:sz w:val="30"/>
+          <w:szCs w:val="30"/>
+        </w:rPr>
+        <w:t xml:space="preserve"> payment processing and payment-related </w:t>
+      </w:r>
+      <w:proofErr w:type="spellStart"/>
+      <w:r>
+        <w:rPr>
+          <w:sz w:val="30"/>
+          <w:szCs w:val="30"/>
+        </w:rPr>
+        <w:t>operationsOrderServiceHandles</w:t>
+      </w:r>
+      <w:proofErr w:type="spellEnd"/>
+      <w:r>
+        <w:rPr>
+          <w:sz w:val="30"/>
+          <w:szCs w:val="30"/>
+        </w:rPr>
+        <w:t xml:space="preserve"> order creation and order lifecycle </w:t>
+      </w:r>
+      <w:proofErr w:type="spellStart"/>
+      <w:r>
+        <w:rPr>
+          <w:sz w:val="30"/>
+          <w:szCs w:val="30"/>
+        </w:rPr>
+        <w:t>managementReservationServiceHandles</w:t>
+      </w:r>
+      <w:proofErr w:type="spellEnd"/>
+      <w:r>
+        <w:rPr>
+          <w:sz w:val="30"/>
+          <w:szCs w:val="30"/>
+        </w:rPr>
+        <w:t xml:space="preserve"> reservation creation, expiry and </w:t>
+      </w:r>
+      <w:proofErr w:type="spellStart"/>
+      <w:r>
+        <w:rPr>
+          <w:sz w:val="30"/>
+          <w:szCs w:val="30"/>
+        </w:rPr>
+        <w:t>releaseInventoryRepositoryHandles</w:t>
+      </w:r>
+      <w:proofErr w:type="spellEnd"/>
+      <w:r>
+        <w:rPr>
+          <w:sz w:val="30"/>
+          <w:szCs w:val="30"/>
+        </w:rPr>
+        <w:t xml:space="preserve"> inventory data </w:t>
+      </w:r>
+      <w:proofErr w:type="spellStart"/>
+      <w:r>
+        <w:rPr>
+          <w:sz w:val="30"/>
+          <w:szCs w:val="30"/>
+        </w:rPr>
+        <w:t>persistencePaymentRepositoryHandles</w:t>
+      </w:r>
+      <w:proofErr w:type="spellEnd"/>
+      <w:r>
+        <w:rPr>
+          <w:sz w:val="30"/>
+          <w:szCs w:val="30"/>
+        </w:rPr>
+        <w:t xml:space="preserve"> payment data </w:t>
+      </w:r>
+      <w:proofErr w:type="spellStart"/>
+      <w:r>
+        <w:rPr>
+          <w:sz w:val="30"/>
+          <w:szCs w:val="30"/>
+        </w:rPr>
+        <w:t>persistenceOrderRepositoryHandles</w:t>
+      </w:r>
+      <w:proofErr w:type="spellEnd"/>
+      <w:r>
+        <w:rPr>
+          <w:sz w:val="30"/>
+          <w:szCs w:val="30"/>
+        </w:rPr>
+        <w:t xml:space="preserve"> order data persistence</w:t>
+      </w:r>
+    </w:p>
+    <w:p>
+      <w:pPr>
+        <w:rPr>
+          <w:sz w:val="30"/>
+          <w:szCs w:val="30"/>
+        </w:rPr>
+      </w:pPr>
+      <w:r>
+        <w:rPr>
+          <w:b/>
+          <w:bCs/>
+          <w:sz w:val="30"/>
+          <w:szCs w:val="30"/>
+        </w:rPr>
+        <w:t>Design benefit:</w:t>
+      </w:r>
+      <w:r>
+        <w:rPr>
+          <w:sz w:val="30"/>
+          <w:szCs w:val="30"/>
+        </w:rPr>
+        <w:t xml:space="preserve"> Each class has one focused responsibility, making the system easier to maintain, test and modify. SALESTORM_SYSCRAFTERS_2026_Desi…</w:t>
+      </w:r>
+    </w:p>
+    <w:p>
+      <w:pPr>
+        <w:rPr>
+          <w:b/>
+          <w:bCs/>
+          <w:sz w:val="30"/>
+          <w:szCs w:val="30"/>
+        </w:rPr>
+      </w:pPr>
+      <w:r>
+        <w:rPr>
+          <w:b/>
+          <w:bCs/>
+          <w:sz w:val="30"/>
+          <w:szCs w:val="30"/>
+        </w:rPr>
+        <w:t>2. Open/Closed Principle (OCP)</w:t>
+      </w:r>
+    </w:p>
+    <w:p>
+      <w:pPr>
+        <w:rPr>
+          <w:sz w:val="30"/>
+          <w:szCs w:val="30"/>
+        </w:rPr>
+      </w:pPr>
+      <w:proofErr w:type="spellStart"/>
+      <w:r>
+        <w:rPr>
+          <w:sz w:val="30"/>
+          <w:szCs w:val="30"/>
+        </w:rPr>
+        <w:t>PaymentService</w:t>
+      </w:r>
+      <w:proofErr w:type="spellEnd"/>
+      <w:r>
+        <w:rPr>
+          <w:sz w:val="30"/>
+          <w:szCs w:val="30"/>
+        </w:rPr>
+        <w:t xml:space="preserve"> should support adding new payment strategies without modifying its core logic.</w:t>
+      </w:r>
+    </w:p>
+    <w:p>
+      <w:pPr>
+        <w:rPr>
+          <w:sz w:val="30"/>
+          <w:szCs w:val="30"/>
+        </w:rPr>
+      </w:pPr>
+      <w:proofErr w:type="spellStart"/>
+      <w:r>
+        <w:rPr>
+          <w:sz w:val="30"/>
+          <w:szCs w:val="30"/>
+        </w:rPr>
+        <w:t>PaymentService</w:t>
+      </w:r>
+      <w:proofErr w:type="spellEnd"/>
+      <w:r>
+        <w:rPr>
+          <w:sz w:val="30"/>
+          <w:szCs w:val="30"/>
+        </w:rPr>
+        <w:t xml:space="preserve"> ↓ </w:t>
+      </w:r>
+      <w:proofErr w:type="spellStart"/>
+      <w:r>
+        <w:rPr>
+          <w:sz w:val="30"/>
+          <w:szCs w:val="30"/>
+        </w:rPr>
+        <w:t>PaymentStrategy</w:t>
+      </w:r>
+      <w:proofErr w:type="spellEnd"/>
+      <w:r>
+        <w:rPr>
+          <w:sz w:val="30"/>
+          <w:szCs w:val="30"/>
+        </w:rPr>
+        <w:t xml:space="preserve"> ↙ ↘ UPI Card</w:t>
+      </w:r>
+    </w:p>
+    <w:p>
+      <w:pPr>
+        <w:rPr>
+          <w:sz w:val="30"/>
+          <w:szCs w:val="30"/>
+        </w:rPr>
+      </w:pPr>
+      <w:r>
+        <w:rPr>
+          <w:b/>
+          <w:bCs/>
+          <w:sz w:val="30"/>
+          <w:szCs w:val="30"/>
+        </w:rPr>
+        <w:t>Example:</w:t>
+      </w:r>
+      <w:r>
+        <w:rPr>
+          <w:sz w:val="30"/>
+          <w:szCs w:val="30"/>
+        </w:rPr>
+        <w:t xml:space="preserve"> A new </w:t>
+      </w:r>
+      <w:proofErr w:type="spellStart"/>
+      <w:r>
+        <w:rPr>
+          <w:sz w:val="30"/>
+          <w:szCs w:val="30"/>
+        </w:rPr>
+        <w:t>WalletPaymentStrategy</w:t>
+      </w:r>
+      <w:proofErr w:type="spellEnd"/>
+      <w:r>
+        <w:rPr>
+          <w:sz w:val="30"/>
+          <w:szCs w:val="30"/>
+        </w:rPr>
+        <w:t xml:space="preserve"> can be added without changing </w:t>
+      </w:r>
+      <w:proofErr w:type="spellStart"/>
+      <w:r>
+        <w:rPr>
+          <w:sz w:val="30"/>
+          <w:szCs w:val="30"/>
+        </w:rPr>
+        <w:t>PaymentService</w:t>
+      </w:r>
+      <w:proofErr w:type="spellEnd"/>
+      <w:r>
+        <w:rPr>
+          <w:sz w:val="30"/>
+          <w:szCs w:val="30"/>
+        </w:rPr>
+        <w:t>.</w:t>
+      </w:r>
+    </w:p>
+    <w:p>
+      <w:pPr>
+        <w:rPr>
+          <w:b/>
+          <w:bCs/>
+          <w:sz w:val="30"/>
+          <w:szCs w:val="30"/>
+        </w:rPr>
+      </w:pPr>
+      <w:r>
+        <w:rPr>
+          <w:b/>
+          <w:bCs/>
+          <w:sz w:val="30"/>
+          <w:szCs w:val="30"/>
+        </w:rPr>
+        <w:t xml:space="preserve">3. </w:t>
+      </w:r>
+      <w:proofErr w:type="spellStart"/>
+      <w:r>
+        <w:rPr>
+          <w:b/>
+          <w:bCs/>
+          <w:sz w:val="30"/>
+          <w:szCs w:val="30"/>
+        </w:rPr>
+        <w:t>Liskov</w:t>
+      </w:r>
+      <w:proofErr w:type="spellEnd"/>
+      <w:r>
+        <w:rPr>
+          <w:b/>
+          <w:bCs/>
+          <w:sz w:val="30"/>
+          <w:szCs w:val="30"/>
+        </w:rPr>
+        <w:t xml:space="preserve"> Substitution Principle (LSP)</w:t>
+      </w:r>
+    </w:p>
+    <w:p>
+      <w:pPr>
+        <w:rPr>
+          <w:sz w:val="30"/>
+          <w:szCs w:val="30"/>
+        </w:rPr>
+      </w:pPr>
+      <w:r>
+        <w:rPr>
+          <w:sz w:val="30"/>
+          <w:szCs w:val="30"/>
+        </w:rPr>
+        <w:t>Different payment providers should be replaceable through the PaymentProvider interface.</w:t>
+      </w:r>
+    </w:p>
+    <w:p>
+      <w:pPr>
+        <w:rPr>
+          <w:sz w:val="30"/>
+          <w:szCs w:val="30"/>
+        </w:rPr>
+      </w:pPr>
+      <w:r>
+        <w:rPr>
+          <w:sz w:val="30"/>
+          <w:szCs w:val="30"/>
+        </w:rPr>
+        <w:t xml:space="preserve">PaymentProvider ↙ ↘ </w:t>
+      </w:r>
+      <w:proofErr w:type="spellStart"/>
+      <w:r>
+        <w:rPr>
+          <w:sz w:val="30"/>
+          <w:szCs w:val="30"/>
+        </w:rPr>
+        <w:t>ProviderA</w:t>
+      </w:r>
+      <w:proofErr w:type="spellEnd"/>
+      <w:r>
+        <w:rPr>
+          <w:sz w:val="30"/>
+          <w:szCs w:val="30"/>
+        </w:rPr>
+        <w:t xml:space="preserve"> </w:t>
+      </w:r>
+      <w:proofErr w:type="spellStart"/>
+      <w:r>
+        <w:rPr>
+          <w:sz w:val="30"/>
+          <w:szCs w:val="30"/>
+        </w:rPr>
+        <w:t>ProviderB</w:t>
+      </w:r>
+      <w:proofErr w:type="spellEnd"/>
+    </w:p>
+    <w:p>
+      <w:pPr>
+        <w:rPr>
+          <w:sz w:val="30"/>
+          <w:szCs w:val="30"/>
+        </w:rPr>
+      </w:pPr>
+      <w:r>
+        <w:rPr>
+          <w:sz w:val="30"/>
+          <w:szCs w:val="30"/>
+        </w:rPr>
+        <w:t>Any implementation of PaymentProvider should be usable wherever the interface is expected.</w:t>
+      </w:r>
+    </w:p>
+    <w:p>
+      <w:pPr>
+        <w:rPr>
+          <w:b/>
+          <w:bCs/>
+          <w:sz w:val="30"/>
+          <w:szCs w:val="30"/>
+        </w:rPr>
+      </w:pPr>
+      <w:r>
+        <w:rPr>
+          <w:b/>
+          <w:bCs/>
+          <w:sz w:val="30"/>
+          <w:szCs w:val="30"/>
+        </w:rPr>
+        <w:t>4. Interface Segregation Principle (ISP)</w:t>
+      </w:r>
+    </w:p>
+    <w:p>
+      <w:pPr>
+        <w:rPr>
+          <w:sz w:val="30"/>
+          <w:szCs w:val="30"/>
+        </w:rPr>
+      </w:pPr>
+      <w:r>
+        <w:rPr>
+          <w:sz w:val="30"/>
+          <w:szCs w:val="30"/>
+        </w:rPr>
+        <w:t>Use small, focused interfaces instead of one large interface.</w:t>
+      </w:r>
+    </w:p>
+    <w:p>
+      <w:pPr>
+        <w:rPr>
+          <w:sz w:val="30"/>
+          <w:szCs w:val="30"/>
+        </w:rPr>
+      </w:pPr>
+      <w:r>
+        <w:rPr>
+          <w:sz w:val="30"/>
+          <w:szCs w:val="30"/>
+        </w:rPr>
+        <w:t xml:space="preserve">PaymentProvider → </w:t>
+      </w:r>
+      <w:proofErr w:type="gramStart"/>
+      <w:r>
+        <w:rPr>
+          <w:sz w:val="30"/>
+          <w:szCs w:val="30"/>
+        </w:rPr>
+        <w:t>pay(</w:t>
+      </w:r>
+      <w:proofErr w:type="gramEnd"/>
+      <w:r>
+        <w:rPr>
+          <w:sz w:val="30"/>
+          <w:szCs w:val="30"/>
+        </w:rPr>
+        <w:t xml:space="preserve">) → </w:t>
+      </w:r>
+      <w:proofErr w:type="spellStart"/>
+      <w:proofErr w:type="gramStart"/>
+      <w:r>
+        <w:rPr>
+          <w:sz w:val="30"/>
+          <w:szCs w:val="30"/>
+        </w:rPr>
+        <w:t>checkStatus</w:t>
+      </w:r>
+      <w:proofErr w:type="spellEnd"/>
+      <w:r>
+        <w:rPr>
+          <w:sz w:val="30"/>
+          <w:szCs w:val="30"/>
+        </w:rPr>
+        <w:t>(</w:t>
+      </w:r>
+      <w:proofErr w:type="gramEnd"/>
+      <w:r>
+        <w:rPr>
+          <w:sz w:val="30"/>
+          <w:szCs w:val="30"/>
+        </w:rPr>
+        <w:t xml:space="preserve">) </w:t>
+      </w:r>
+      <w:proofErr w:type="spellStart"/>
+      <w:r>
+        <w:rPr>
+          <w:sz w:val="30"/>
+          <w:szCs w:val="30"/>
+        </w:rPr>
+        <w:t>PaymentRepository</w:t>
+      </w:r>
+      <w:proofErr w:type="spellEnd"/>
+      <w:r>
+        <w:rPr>
+          <w:sz w:val="30"/>
+          <w:szCs w:val="30"/>
+        </w:rPr>
+        <w:t xml:space="preserve"> → </w:t>
+      </w:r>
+      <w:proofErr w:type="spellStart"/>
+      <w:proofErr w:type="gramStart"/>
+      <w:r>
+        <w:rPr>
+          <w:sz w:val="30"/>
+          <w:szCs w:val="30"/>
+        </w:rPr>
+        <w:t>savePayment</w:t>
+      </w:r>
+      <w:proofErr w:type="spellEnd"/>
+      <w:r>
+        <w:rPr>
+          <w:sz w:val="30"/>
+          <w:szCs w:val="30"/>
+        </w:rPr>
+        <w:t>(</w:t>
+      </w:r>
+      <w:proofErr w:type="gramEnd"/>
+      <w:r>
+        <w:rPr>
+          <w:sz w:val="30"/>
+          <w:szCs w:val="30"/>
+        </w:rPr>
+        <w:t xml:space="preserve">) → </w:t>
+      </w:r>
+      <w:proofErr w:type="spellStart"/>
+      <w:proofErr w:type="gramStart"/>
+      <w:r>
+        <w:rPr>
+          <w:sz w:val="30"/>
+          <w:szCs w:val="30"/>
+        </w:rPr>
+        <w:t>findById</w:t>
+      </w:r>
+      <w:proofErr w:type="spellEnd"/>
+      <w:r>
+        <w:rPr>
+          <w:sz w:val="30"/>
+          <w:szCs w:val="30"/>
+        </w:rPr>
+        <w:t>(</w:t>
+      </w:r>
+      <w:proofErr w:type="gramEnd"/>
+      <w:r>
+        <w:rPr>
+          <w:sz w:val="30"/>
+          <w:szCs w:val="30"/>
+        </w:rPr>
+        <w:t>)</w:t>
+      </w:r>
+    </w:p>
+    <w:p>
+      <w:pPr>
+        <w:rPr>
+          <w:sz w:val="30"/>
+          <w:szCs w:val="30"/>
+        </w:rPr>
+      </w:pPr>
+      <w:r>
+        <w:rPr>
+          <w:sz w:val="30"/>
+          <w:szCs w:val="30"/>
+        </w:rPr>
+        <w:t>Classes only depend on the operations they actually need.</w:t>
+      </w:r>
+    </w:p>
+    <w:p>
+      <w:pPr>
+        <w:rPr>
+          <w:b/>
+          <w:bCs/>
+          <w:sz w:val="30"/>
+          <w:szCs w:val="30"/>
+        </w:rPr>
+      </w:pPr>
+      <w:r>
+        <w:rPr>
+          <w:b/>
+          <w:bCs/>
+          <w:sz w:val="30"/>
+          <w:szCs w:val="30"/>
+        </w:rPr>
+        <w:lastRenderedPageBreak/>
+        <w:t>5. Dependency Inversion Principle (DIP)</w:t>
+      </w:r>
+    </w:p>
+    <w:p>
+      <w:pPr>
+        <w:rPr>
+          <w:sz w:val="30"/>
+          <w:szCs w:val="30"/>
+        </w:rPr>
+      </w:pPr>
+      <w:r>
+        <w:rPr>
+          <w:sz w:val="30"/>
+          <w:szCs w:val="30"/>
+        </w:rPr>
+        <w:t>High-level services should depend on abstractions rather than concrete implementations.</w:t>
+      </w:r>
+    </w:p>
+    <w:p>
+      <w:pPr>
+        <w:rPr>
+          <w:sz w:val="30"/>
+          <w:szCs w:val="30"/>
+        </w:rPr>
+      </w:pPr>
+      <w:proofErr w:type="spellStart"/>
+      <w:r>
+        <w:rPr>
+          <w:sz w:val="30"/>
+          <w:szCs w:val="30"/>
+        </w:rPr>
+        <w:t>PaymentService</w:t>
+      </w:r>
+      <w:proofErr w:type="spellEnd"/>
+      <w:r>
+        <w:rPr>
+          <w:sz w:val="30"/>
+          <w:szCs w:val="30"/>
+        </w:rPr>
+        <w:t xml:space="preserve"> ↓ PaymentProvider (Interface) ↓ External Payment Provider</w:t>
+      </w:r>
+    </w:p>
+    <w:p>
+      <w:pPr>
+        <w:rPr>
+          <w:sz w:val="30"/>
+          <w:szCs w:val="30"/>
+        </w:rPr>
+      </w:pPr>
+      <w:r>
+        <w:rPr>
+          <w:sz w:val="30"/>
+          <w:szCs w:val="30"/>
+        </w:rPr>
+        <w:t>Similarly:</w:t>
+      </w:r>
+    </w:p>
+    <w:p>
+      <w:pPr>
+        <w:rPr>
+          <w:sz w:val="30"/>
+          <w:szCs w:val="30"/>
+        </w:rPr>
+      </w:pPr>
+      <w:proofErr w:type="spellStart"/>
+      <w:r>
+        <w:rPr>
+          <w:sz w:val="30"/>
+          <w:szCs w:val="30"/>
+        </w:rPr>
+        <w:t>OrderService</w:t>
+      </w:r>
+      <w:proofErr w:type="spellEnd"/>
+      <w:r>
+        <w:rPr>
+          <w:sz w:val="30"/>
+          <w:szCs w:val="30"/>
+        </w:rPr>
+        <w:t xml:space="preserve"> ↓ </w:t>
+      </w:r>
+      <w:proofErr w:type="spellStart"/>
+      <w:r>
+        <w:rPr>
+          <w:sz w:val="30"/>
+          <w:szCs w:val="30"/>
+        </w:rPr>
+        <w:t>OrderRepository</w:t>
+      </w:r>
+      <w:proofErr w:type="spellEnd"/>
+      <w:r>
+        <w:rPr>
+          <w:sz w:val="30"/>
+          <w:szCs w:val="30"/>
+        </w:rPr>
+        <w:t xml:space="preserve"> ↓ Database</w:t>
+      </w:r>
+    </w:p>
+    <w:p>
+      <w:pPr>
+        <w:rPr>
+          <w:sz w:val="30"/>
+          <w:szCs w:val="30"/>
+        </w:rPr>
+      </w:pPr>
+      <w:r>
+        <w:rPr>
+          <w:sz w:val="30"/>
+          <w:szCs w:val="30"/>
+        </w:rPr>
+        <w:t>This makes external providers and persistence implementations easier to replace. SALESTORM_SYSCRAFTERS_2026_Desi…</w:t>
+      </w:r>
+    </w:p>
+    <w:p>
+      <w:pPr>
+        <w:rPr>
+          <w:b/>
+          <w:bCs/>
+          <w:sz w:val="30"/>
+          <w:szCs w:val="30"/>
+        </w:rPr>
+      </w:pPr>
+    </w:p>
+    <w:p>
+      <w:pPr>
+        <w:rPr>
+          <w:b/>
+          <w:bCs/>
+          <w:sz w:val="30"/>
+          <w:szCs w:val="30"/>
+        </w:rPr>
+      </w:pPr>
+    </w:p>
+    <w:p>
+      <w:pPr>
+        <w:rPr>
+          <w:b/>
+          <w:bCs/>
+          <w:sz w:val="30"/>
+          <w:szCs w:val="30"/>
+        </w:rPr>
+      </w:pPr>
+    </w:p>
+    <w:p>
+      <w:pPr>
+        <w:rPr>
+          <w:b/>
+          <w:bCs/>
+          <w:sz w:val="30"/>
+          <w:szCs w:val="30"/>
+        </w:rPr>
+      </w:pPr>
+    </w:p>
+    <w:p>
+      <w:pPr>
+        <w:rPr>
+          <w:b/>
+          <w:bCs/>
+          <w:sz w:val="30"/>
+          <w:szCs w:val="30"/>
+        </w:rPr>
+      </w:pPr>
+    </w:p>
+    <w:p>
+      <w:pPr>
+        <w:rPr>
+          <w:b/>
+          <w:bCs/>
+          <w:sz w:val="30"/>
+          <w:szCs w:val="30"/>
+        </w:rPr>
+      </w:pPr>
+    </w:p>
+    <w:p>
+      <w:pPr>
+        <w:rPr>
+          <w:b/>
+          <w:bCs/>
+          <w:sz w:val="30"/>
+          <w:szCs w:val="30"/>
+        </w:rPr>
+      </w:pPr>
+    </w:p>
+    <w:p>
+      <w:pPr>
+        <w:rPr>
+          <w:b/>
+          <w:bCs/>
+          <w:sz w:val="30"/>
+          <w:szCs w:val="30"/>
+        </w:rPr>
+      </w:pPr>
+    </w:p>
+    <w:p>
+      <w:pPr>
+        <w:rPr>
+          <w:b/>
+          <w:bCs/>
+          <w:sz w:val="30"/>
+          <w:szCs w:val="30"/>
+        </w:rPr>
+      </w:pPr>
+    </w:p>
+    <w:p>
+      <w:pPr>
+        <w:rPr>
+          <w:b/>
+          <w:bCs/>
+          <w:sz w:val="30"/>
+          <w:szCs w:val="30"/>
+        </w:rPr>
+      </w:pPr>
+    </w:p>
+    <w:p>
+      <w:pPr>
+        <w:rPr>
+          <w:b/>
+          <w:bCs/>
+          <w:sz w:val="30"/>
+          <w:szCs w:val="30"/>
+        </w:rPr>
+      </w:pPr>
+    </w:p>
+    <w:p>
+      <w:pPr>
+        <w:rPr>
+          <w:b/>
+          <w:bCs/>
+          <w:sz w:val="30"/>
+          <w:szCs w:val="30"/>
+        </w:rPr>
+      </w:pPr>
+    </w:p>
+    <w:p>
+      <w:pPr>
+        <w:rPr>
+          <w:b/>
+          <w:bCs/>
+          <w:sz w:val="30"/>
+          <w:szCs w:val="30"/>
+        </w:rPr>
+      </w:pPr>
+      <w:r>
+        <w:rPr>
+          <w:b/>
+          <w:bCs/>
+          <w:sz w:val="30"/>
+          <w:szCs w:val="30"/>
+        </w:rPr>
+        <w:lastRenderedPageBreak/>
+        <w:t>Design Pattern Mapping</w:t>
+      </w:r>
+    </w:p>
+    <w:tbl>
+      <w:tblPr>
+        <w:tblW w:w="0" w:type="auto"/>
+        <w:tblCellSpacing w:w="15" w:type="dxa"/>
+        <w:tblBorders>
+          <w:top w:val="single" w:sz="4" w:space="0" w:color="auto"/>
+          <w:left w:val="single" w:sz="4" w:space="0" w:color="auto"/>
+          <w:bottom w:val="single" w:sz="4" w:space="0" w:color="auto"/>
+          <w:right w:val="single" w:sz="4" w:space="0" w:color="auto"/>
+          <w:insideH w:val="single" w:sz="4" w:space="0" w:color="auto"/>
+          <w:insideV w:val="single" w:sz="4" w:space="0" w:color="auto"/>
+        </w:tblBorders>
+        <w:tblCellMar>
+          <w:top w:w="15" w:type="dxa"/>
+          <w:left w:w="15" w:type="dxa"/>
+          <w:bottom w:w="15" w:type="dxa"/>
+          <w:right w:w="15" w:type="dxa"/>
+        </w:tblCellMar>
+        <w:tblLook w:val="04A0" w:firstRow="1" w:lastRow="0" w:firstColumn="1" w:lastColumn="0" w:noHBand="0" w:noVBand="1"/>
+      </w:tblPr>
+      <w:tblGrid>
+        <w:gridCol w:w="2138"/>
+        <w:gridCol w:w="3550"/>
+        <w:gridCol w:w="3358"/>
+        <w:gridCol w:w="3381"/>
+        <w:gridCol w:w="2524"/>
+      </w:tblGrid>
+      <w:tr>
+        <w:trPr>
+          <w:tblHeader/>
+          <w:tblCellSpacing w:w="15" w:type="dxa"/>
+        </w:trPr>
+        <w:tc>
+          <w:tcPr>
+            <w:tcW w:w="0" w:type="auto"/>
+            <w:vAlign w:val="center"/>
+            <w:hideMark/>
+          </w:tcPr>
+          <w:p>
+            <w:pPr>
+              <w:rPr>
+                <w:b/>
+                <w:bCs/>
+                <w:sz w:val="30"/>
+                <w:szCs w:val="30"/>
+              </w:rPr>
+            </w:pPr>
+            <w:r>
+              <w:rPr>
+                <w:b/>
+                <w:bCs/>
+                <w:sz w:val="30"/>
+                <w:szCs w:val="30"/>
+              </w:rPr>
+              <w:t>Pattern</w:t>
+            </w:r>
+          </w:p>
+        </w:tc>
+        <w:tc>
+          <w:tcPr>
+            <w:tcW w:w="0" w:type="auto"/>
+            <w:vAlign w:val="center"/>
+            <w:hideMark/>
+          </w:tcPr>
+          <w:p>
+            <w:pPr>
+              <w:rPr>
+                <w:b/>
+                <w:bCs/>
+                <w:sz w:val="30"/>
+                <w:szCs w:val="30"/>
+              </w:rPr>
+            </w:pPr>
+            <w:r>
+              <w:rPr>
+                <w:b/>
+                <w:bCs/>
+                <w:sz w:val="30"/>
+                <w:szCs w:val="30"/>
+              </w:rPr>
+              <w:t>Problem</w:t>
+            </w:r>
+          </w:p>
+        </w:tc>
+        <w:tc>
+          <w:tcPr>
+            <w:tcW w:w="0" w:type="auto"/>
+            <w:vAlign w:val="center"/>
+            <w:hideMark/>
+          </w:tcPr>
+          <w:p>
+            <w:pPr>
+              <w:rPr>
+                <w:b/>
+                <w:bCs/>
+                <w:sz w:val="30"/>
+                <w:szCs w:val="30"/>
+              </w:rPr>
+            </w:pPr>
+            <w:r>
+              <w:rPr>
+                <w:b/>
+                <w:bCs/>
+                <w:sz w:val="30"/>
+                <w:szCs w:val="30"/>
+              </w:rPr>
+              <w:t xml:space="preserve">Where </w:t>
+            </w:r>
+            <w:proofErr w:type="gramStart"/>
+            <w:r>
+              <w:rPr>
+                <w:b/>
+                <w:bCs/>
+                <w:sz w:val="30"/>
+                <w:szCs w:val="30"/>
+              </w:rPr>
+              <w:t>Used</w:t>
+            </w:r>
+            <w:proofErr w:type="gramEnd"/>
+          </w:p>
+        </w:tc>
+        <w:tc>
+          <w:tcPr>
+            <w:tcW w:w="0" w:type="auto"/>
+            <w:vAlign w:val="center"/>
+            <w:hideMark/>
+          </w:tcPr>
+          <w:p>
+            <w:pPr>
+              <w:rPr>
+                <w:b/>
+                <w:bCs/>
+                <w:sz w:val="30"/>
+                <w:szCs w:val="30"/>
+              </w:rPr>
+            </w:pPr>
+            <w:r>
+              <w:rPr>
+                <w:b/>
+                <w:bCs/>
+                <w:sz w:val="30"/>
+                <w:szCs w:val="30"/>
+              </w:rPr>
+              <w:t>Why Useful</w:t>
+            </w:r>
+          </w:p>
+        </w:tc>
+        <w:tc>
+          <w:tcPr>
+            <w:tcW w:w="0" w:type="auto"/>
+            <w:vAlign w:val="center"/>
+            <w:hideMark/>
+          </w:tcPr>
+          <w:p>
+            <w:pPr>
+              <w:rPr>
+                <w:b/>
+                <w:bCs/>
+                <w:sz w:val="30"/>
+                <w:szCs w:val="30"/>
+              </w:rPr>
+            </w:pPr>
+            <w:r>
+              <w:rPr>
+                <w:b/>
+                <w:bCs/>
+                <w:sz w:val="30"/>
+                <w:szCs w:val="30"/>
+              </w:rPr>
+              <w:t>Trade-off</w:t>
+            </w:r>
+          </w:p>
+        </w:tc>
+      </w:tr>
+      <w:tr>
+        <w:trPr>
+          <w:tblCellSpacing w:w="15" w:type="dxa"/>
+        </w:trPr>
+        <w:tc>
+          <w:tcPr>
+            <w:tcW w:w="0" w:type="auto"/>
+            <w:vAlign w:val="center"/>
+            <w:hideMark/>
+          </w:tcPr>
+          <w:p>
+            <w:pPr>
+              <w:rPr>
+                <w:sz w:val="30"/>
+                <w:szCs w:val="30"/>
+              </w:rPr>
+            </w:pPr>
+            <w:r>
+              <w:rPr>
+                <w:b/>
+                <w:bCs/>
+                <w:sz w:val="30"/>
+                <w:szCs w:val="30"/>
+              </w:rPr>
+              <w:t>Strategy</w:t>
+            </w:r>
+          </w:p>
+        </w:tc>
+        <w:tc>
+          <w:tcPr>
+            <w:tcW w:w="0" w:type="auto"/>
+            <w:vAlign w:val="center"/>
+            <w:hideMark/>
+          </w:tcPr>
+          <w:p>
+            <w:pPr>
+              <w:rPr>
+                <w:sz w:val="30"/>
+                <w:szCs w:val="30"/>
+              </w:rPr>
+            </w:pPr>
+            <w:r>
+              <w:rPr>
+                <w:sz w:val="30"/>
+                <w:szCs w:val="30"/>
+              </w:rPr>
+              <w:t>Multiple payment methods</w:t>
+            </w:r>
+          </w:p>
+        </w:tc>
+        <w:tc>
+          <w:tcPr>
+            <w:tcW w:w="0" w:type="auto"/>
+            <w:vAlign w:val="center"/>
+            <w:hideMark/>
+          </w:tcPr>
+          <w:p>
+            <w:pPr>
+              <w:rPr>
+                <w:sz w:val="30"/>
+                <w:szCs w:val="30"/>
+              </w:rPr>
+            </w:pPr>
+            <w:r>
+              <w:rPr>
+                <w:sz w:val="30"/>
+                <w:szCs w:val="30"/>
+              </w:rPr>
+              <w:t>Payment</w:t>
+            </w:r>
+          </w:p>
+        </w:tc>
+        <w:tc>
+          <w:tcPr>
+            <w:tcW w:w="0" w:type="auto"/>
+            <w:vAlign w:val="center"/>
+            <w:hideMark/>
+          </w:tcPr>
+          <w:p>
+            <w:pPr>
+              <w:rPr>
+                <w:sz w:val="30"/>
+                <w:szCs w:val="30"/>
+              </w:rPr>
+            </w:pPr>
+            <w:r>
+              <w:rPr>
+                <w:sz w:val="30"/>
+                <w:szCs w:val="30"/>
+              </w:rPr>
+              <w:t>Easy to add new methods</w:t>
+            </w:r>
+          </w:p>
+        </w:tc>
+        <w:tc>
+          <w:tcPr>
+            <w:tcW w:w="0" w:type="auto"/>
+            <w:vAlign w:val="center"/>
+            <w:hideMark/>
+          </w:tcPr>
+          <w:p>
+            <w:pPr>
+              <w:rPr>
+                <w:sz w:val="30"/>
+                <w:szCs w:val="30"/>
+              </w:rPr>
+            </w:pPr>
+            <w:r>
+              <w:rPr>
+                <w:sz w:val="30"/>
+                <w:szCs w:val="30"/>
+              </w:rPr>
+              <w:t>More classes</w:t>
+            </w:r>
+          </w:p>
+        </w:tc>
+      </w:tr>
+      <w:tr>
+        <w:trPr>
+          <w:tblCellSpacing w:w="15" w:type="dxa"/>
+        </w:trPr>
+        <w:tc>
+          <w:tcPr>
+            <w:tcW w:w="0" w:type="auto"/>
+            <w:vAlign w:val="center"/>
+            <w:hideMark/>
+          </w:tcPr>
+          <w:p>
+            <w:pPr>
+              <w:rPr>
+                <w:sz w:val="30"/>
+                <w:szCs w:val="30"/>
+              </w:rPr>
+            </w:pPr>
+            <w:r>
+              <w:rPr>
+                <w:b/>
+                <w:bCs/>
+                <w:sz w:val="30"/>
+                <w:szCs w:val="30"/>
+              </w:rPr>
+              <w:t>Factory</w:t>
+            </w:r>
+          </w:p>
+        </w:tc>
+        <w:tc>
+          <w:tcPr>
+            <w:tcW w:w="0" w:type="auto"/>
+            <w:vAlign w:val="center"/>
+            <w:hideMark/>
+          </w:tcPr>
+          <w:p>
+            <w:pPr>
+              <w:rPr>
+                <w:sz w:val="30"/>
+                <w:szCs w:val="30"/>
+              </w:rPr>
+            </w:pPr>
+            <w:r>
+              <w:rPr>
+                <w:sz w:val="30"/>
+                <w:szCs w:val="30"/>
+              </w:rPr>
+              <w:t>Provider creation</w:t>
+            </w:r>
+          </w:p>
+        </w:tc>
+        <w:tc>
+          <w:tcPr>
+            <w:tcW w:w="0" w:type="auto"/>
+            <w:vAlign w:val="center"/>
+            <w:hideMark/>
+          </w:tcPr>
+          <w:p>
+            <w:pPr>
+              <w:rPr>
+                <w:sz w:val="30"/>
+                <w:szCs w:val="30"/>
+              </w:rPr>
+            </w:pPr>
+            <w:r>
+              <w:rPr>
+                <w:sz w:val="30"/>
+                <w:szCs w:val="30"/>
+              </w:rPr>
+              <w:t>Payment</w:t>
+            </w:r>
+          </w:p>
+        </w:tc>
+        <w:tc>
+          <w:tcPr>
+            <w:tcW w:w="0" w:type="auto"/>
+            <w:vAlign w:val="center"/>
+            <w:hideMark/>
+          </w:tcPr>
+          <w:p>
+            <w:pPr>
+              <w:rPr>
+                <w:sz w:val="30"/>
+                <w:szCs w:val="30"/>
+              </w:rPr>
+            </w:pPr>
+            <w:r>
+              <w:rPr>
+                <w:sz w:val="30"/>
+                <w:szCs w:val="30"/>
+              </w:rPr>
+              <w:t>Reduces coupling</w:t>
+            </w:r>
+          </w:p>
+        </w:tc>
+        <w:tc>
+          <w:tcPr>
+            <w:tcW w:w="0" w:type="auto"/>
+            <w:vAlign w:val="center"/>
+            <w:hideMark/>
+          </w:tcPr>
+          <w:p>
+            <w:pPr>
+              <w:rPr>
+                <w:sz w:val="30"/>
+                <w:szCs w:val="30"/>
+              </w:rPr>
+            </w:pPr>
+            <w:r>
+              <w:rPr>
+                <w:sz w:val="30"/>
+                <w:szCs w:val="30"/>
+              </w:rPr>
+              <w:t>Extra logic</w:t>
+            </w:r>
+          </w:p>
+        </w:tc>
+      </w:tr>
+      <w:tr>
+        <w:trPr>
+          <w:tblCellSpacing w:w="15" w:type="dxa"/>
+        </w:trPr>
+        <w:tc>
+          <w:tcPr>
+            <w:tcW w:w="0" w:type="auto"/>
+            <w:vAlign w:val="center"/>
+            <w:hideMark/>
+          </w:tcPr>
+          <w:p>
+            <w:pPr>
+              <w:rPr>
+                <w:sz w:val="30"/>
+                <w:szCs w:val="30"/>
+              </w:rPr>
+            </w:pPr>
+            <w:r>
+              <w:rPr>
+                <w:b/>
+                <w:bCs/>
+                <w:sz w:val="30"/>
+                <w:szCs w:val="30"/>
+              </w:rPr>
+              <w:t>State</w:t>
+            </w:r>
+          </w:p>
+        </w:tc>
+        <w:tc>
+          <w:tcPr>
+            <w:tcW w:w="0" w:type="auto"/>
+            <w:vAlign w:val="center"/>
+            <w:hideMark/>
+          </w:tcPr>
+          <w:p>
+            <w:pPr>
+              <w:rPr>
+                <w:sz w:val="30"/>
+                <w:szCs w:val="30"/>
+              </w:rPr>
+            </w:pPr>
+            <w:r>
+              <w:rPr>
+                <w:sz w:val="30"/>
+                <w:szCs w:val="30"/>
+              </w:rPr>
+              <w:t xml:space="preserve">Status-based </w:t>
+            </w:r>
+            <w:proofErr w:type="spellStart"/>
+            <w:r>
+              <w:rPr>
+                <w:sz w:val="30"/>
+                <w:szCs w:val="30"/>
+              </w:rPr>
+              <w:t>behavior</w:t>
+            </w:r>
+            <w:proofErr w:type="spellEnd"/>
+          </w:p>
+        </w:tc>
+        <w:tc>
+          <w:tcPr>
+            <w:tcW w:w="0" w:type="auto"/>
+            <w:vAlign w:val="center"/>
+            <w:hideMark/>
+          </w:tcPr>
+          <w:p>
+            <w:pPr>
+              <w:rPr>
+                <w:sz w:val="30"/>
+                <w:szCs w:val="30"/>
+              </w:rPr>
+            </w:pPr>
+            <w:r>
+              <w:rPr>
+                <w:sz w:val="30"/>
+                <w:szCs w:val="30"/>
+              </w:rPr>
+              <w:t>Order/Reservation</w:t>
+            </w:r>
+          </w:p>
+        </w:tc>
+        <w:tc>
+          <w:tcPr>
+            <w:tcW w:w="0" w:type="auto"/>
+            <w:vAlign w:val="center"/>
+            <w:hideMark/>
+          </w:tcPr>
+          <w:p>
+            <w:pPr>
+              <w:rPr>
+                <w:sz w:val="30"/>
+                <w:szCs w:val="30"/>
+              </w:rPr>
+            </w:pPr>
+            <w:r>
+              <w:rPr>
+                <w:sz w:val="30"/>
+                <w:szCs w:val="30"/>
+              </w:rPr>
+              <w:t>Clear state transitions</w:t>
+            </w:r>
+          </w:p>
+        </w:tc>
+        <w:tc>
+          <w:tcPr>
+            <w:tcW w:w="0" w:type="auto"/>
+            <w:vAlign w:val="center"/>
+            <w:hideMark/>
+          </w:tcPr>
+          <w:p>
+            <w:pPr>
+              <w:rPr>
+                <w:sz w:val="30"/>
+                <w:szCs w:val="30"/>
+              </w:rPr>
+            </w:pPr>
+            <w:r>
+              <w:rPr>
+                <w:sz w:val="30"/>
+                <w:szCs w:val="30"/>
+              </w:rPr>
+              <w:t>More complexity</w:t>
+            </w:r>
+          </w:p>
+        </w:tc>
+      </w:tr>
+      <w:tr>
+        <w:trPr>
+          <w:tblCellSpacing w:w="15" w:type="dxa"/>
+        </w:trPr>
+        <w:tc>
+          <w:tcPr>
+            <w:tcW w:w="0" w:type="auto"/>
+            <w:vAlign w:val="center"/>
+            <w:hideMark/>
+          </w:tcPr>
+          <w:p>
+            <w:pPr>
+              <w:rPr>
+                <w:sz w:val="30"/>
+                <w:szCs w:val="30"/>
+              </w:rPr>
+            </w:pPr>
+            <w:r>
+              <w:rPr>
+                <w:b/>
+                <w:bCs/>
+                <w:sz w:val="30"/>
+                <w:szCs w:val="30"/>
+              </w:rPr>
+              <w:t>Repository</w:t>
+            </w:r>
+          </w:p>
+        </w:tc>
+        <w:tc>
+          <w:tcPr>
+            <w:tcW w:w="0" w:type="auto"/>
+            <w:vAlign w:val="center"/>
+            <w:hideMark/>
+          </w:tcPr>
+          <w:p>
+            <w:pPr>
+              <w:rPr>
+                <w:sz w:val="30"/>
+                <w:szCs w:val="30"/>
+              </w:rPr>
+            </w:pPr>
+            <w:r>
+              <w:rPr>
+                <w:sz w:val="30"/>
+                <w:szCs w:val="30"/>
+              </w:rPr>
+              <w:t>DB access in services</w:t>
+            </w:r>
+          </w:p>
+        </w:tc>
+        <w:tc>
+          <w:tcPr>
+            <w:tcW w:w="0" w:type="auto"/>
+            <w:vAlign w:val="center"/>
+            <w:hideMark/>
+          </w:tcPr>
+          <w:p>
+            <w:pPr>
+              <w:rPr>
+                <w:sz w:val="30"/>
+                <w:szCs w:val="30"/>
+              </w:rPr>
+            </w:pPr>
+            <w:r>
+              <w:rPr>
+                <w:sz w:val="30"/>
+                <w:szCs w:val="30"/>
+              </w:rPr>
+              <w:t>Inventory/Payment/Order</w:t>
+            </w:r>
+          </w:p>
+        </w:tc>
+        <w:tc>
+          <w:tcPr>
+            <w:tcW w:w="0" w:type="auto"/>
+            <w:vAlign w:val="center"/>
+            <w:hideMark/>
+          </w:tcPr>
+          <w:p>
+            <w:pPr>
+              <w:rPr>
+                <w:sz w:val="30"/>
+                <w:szCs w:val="30"/>
+              </w:rPr>
+            </w:pPr>
+            <w:r>
+              <w:rPr>
+                <w:sz w:val="30"/>
+                <w:szCs w:val="30"/>
+              </w:rPr>
+              <w:t>Separates data access</w:t>
+            </w:r>
+          </w:p>
+        </w:tc>
+        <w:tc>
+          <w:tcPr>
+            <w:tcW w:w="0" w:type="auto"/>
+            <w:vAlign w:val="center"/>
+            <w:hideMark/>
+          </w:tcPr>
+          <w:p>
+            <w:pPr>
+              <w:rPr>
+                <w:sz w:val="30"/>
+                <w:szCs w:val="30"/>
+              </w:rPr>
+            </w:pPr>
+            <w:r>
+              <w:rPr>
+                <w:sz w:val="30"/>
+                <w:szCs w:val="30"/>
+              </w:rPr>
+              <w:t>Extra abstraction</w:t>
+            </w:r>
+          </w:p>
+        </w:tc>
+      </w:tr>
+      <w:tr>
+        <w:trPr>
+          <w:tblCellSpacing w:w="15" w:type="dxa"/>
+        </w:trPr>
+        <w:tc>
+          <w:tcPr>
+            <w:tcW w:w="0" w:type="auto"/>
+            <w:vAlign w:val="center"/>
+            <w:hideMark/>
+          </w:tcPr>
+          <w:p>
+            <w:pPr>
+              <w:rPr>
+                <w:sz w:val="30"/>
+                <w:szCs w:val="30"/>
+              </w:rPr>
+            </w:pPr>
+            <w:r>
+              <w:rPr>
+                <w:b/>
+                <w:bCs/>
+                <w:sz w:val="30"/>
+                <w:szCs w:val="30"/>
+              </w:rPr>
+              <w:t>Adapter</w:t>
+            </w:r>
+          </w:p>
+        </w:tc>
+        <w:tc>
+          <w:tcPr>
+            <w:tcW w:w="0" w:type="auto"/>
+            <w:vAlign w:val="center"/>
+            <w:hideMark/>
+          </w:tcPr>
+          <w:p>
+            <w:pPr>
+              <w:rPr>
+                <w:sz w:val="30"/>
+                <w:szCs w:val="30"/>
+              </w:rPr>
+            </w:pPr>
+            <w:r>
+              <w:rPr>
+                <w:sz w:val="30"/>
+                <w:szCs w:val="30"/>
+              </w:rPr>
+              <w:t>Different provider APIs</w:t>
+            </w:r>
+          </w:p>
+        </w:tc>
+        <w:tc>
+          <w:tcPr>
+            <w:tcW w:w="0" w:type="auto"/>
+            <w:vAlign w:val="center"/>
+            <w:hideMark/>
+          </w:tcPr>
+          <w:p>
+            <w:pPr>
+              <w:rPr>
+                <w:sz w:val="30"/>
+                <w:szCs w:val="30"/>
+              </w:rPr>
+            </w:pPr>
+            <w:r>
+              <w:rPr>
+                <w:sz w:val="30"/>
+                <w:szCs w:val="30"/>
+              </w:rPr>
+              <w:t>Payment</w:t>
+            </w:r>
+          </w:p>
+        </w:tc>
+        <w:tc>
+          <w:tcPr>
+            <w:tcW w:w="0" w:type="auto"/>
+            <w:vAlign w:val="center"/>
+            <w:hideMark/>
+          </w:tcPr>
+          <w:p>
+            <w:pPr>
+              <w:rPr>
+                <w:sz w:val="30"/>
+                <w:szCs w:val="30"/>
+              </w:rPr>
+            </w:pPr>
+            <w:r>
+              <w:rPr>
+                <w:sz w:val="30"/>
+                <w:szCs w:val="30"/>
+              </w:rPr>
+              <w:t>Common interface</w:t>
+            </w:r>
+          </w:p>
+        </w:tc>
+        <w:tc>
+          <w:tcPr>
+            <w:tcW w:w="0" w:type="auto"/>
+            <w:vAlign w:val="center"/>
+            <w:hideMark/>
+          </w:tcPr>
+          <w:p>
+            <w:pPr>
+              <w:rPr>
+                <w:sz w:val="30"/>
+                <w:szCs w:val="30"/>
+              </w:rPr>
+            </w:pPr>
+            <w:r>
+              <w:rPr>
+                <w:sz w:val="30"/>
+                <w:szCs w:val="30"/>
+              </w:rPr>
+              <w:t>Extra layer</w:t>
+            </w:r>
+          </w:p>
+        </w:tc>
+      </w:tr>
+      <w:tr>
+        <w:trPr>
+          <w:tblCellSpacing w:w="15" w:type="dxa"/>
+        </w:trPr>
+        <w:tc>
+          <w:tcPr>
+            <w:tcW w:w="0" w:type="auto"/>
+            <w:vAlign w:val="center"/>
+            <w:hideMark/>
+          </w:tcPr>
+          <w:p>
+            <w:pPr>
+              <w:rPr>
+                <w:sz w:val="30"/>
+                <w:szCs w:val="30"/>
+              </w:rPr>
+            </w:pPr>
+            <w:r>
+              <w:rPr>
+                <w:b/>
+                <w:bCs/>
+                <w:sz w:val="30"/>
+                <w:szCs w:val="30"/>
+              </w:rPr>
+              <w:t>Facade</w:t>
+            </w:r>
+          </w:p>
+        </w:tc>
+        <w:tc>
+          <w:tcPr>
+            <w:tcW w:w="0" w:type="auto"/>
+            <w:vAlign w:val="center"/>
+            <w:hideMark/>
+          </w:tcPr>
+          <w:p>
+            <w:pPr>
+              <w:rPr>
+                <w:sz w:val="30"/>
+                <w:szCs w:val="30"/>
+              </w:rPr>
+            </w:pPr>
+            <w:r>
+              <w:rPr>
+                <w:sz w:val="30"/>
+                <w:szCs w:val="30"/>
+              </w:rPr>
+              <w:t>Complex checkout flow</w:t>
+            </w:r>
+          </w:p>
+        </w:tc>
+        <w:tc>
+          <w:tcPr>
+            <w:tcW w:w="0" w:type="auto"/>
+            <w:vAlign w:val="center"/>
+            <w:hideMark/>
+          </w:tcPr>
+          <w:p>
+            <w:pPr>
+              <w:rPr>
+                <w:sz w:val="30"/>
+                <w:szCs w:val="30"/>
+              </w:rPr>
+            </w:pPr>
+            <w:r>
+              <w:rPr>
+                <w:sz w:val="30"/>
+                <w:szCs w:val="30"/>
+              </w:rPr>
+              <w:t>Checkout</w:t>
+            </w:r>
+          </w:p>
+        </w:tc>
+        <w:tc>
+          <w:tcPr>
+            <w:tcW w:w="0" w:type="auto"/>
+            <w:vAlign w:val="center"/>
+            <w:hideMark/>
+          </w:tcPr>
+          <w:p>
+            <w:pPr>
+              <w:rPr>
+                <w:sz w:val="30"/>
+                <w:szCs w:val="30"/>
+              </w:rPr>
+            </w:pPr>
+            <w:r>
+              <w:rPr>
+                <w:sz w:val="30"/>
+                <w:szCs w:val="30"/>
+              </w:rPr>
+              <w:t>Simple entry point</w:t>
+            </w:r>
+          </w:p>
+        </w:tc>
+        <w:tc>
+          <w:tcPr>
+            <w:tcW w:w="0" w:type="auto"/>
+            <w:vAlign w:val="center"/>
+            <w:hideMark/>
+          </w:tcPr>
+          <w:p>
+            <w:pPr>
+              <w:rPr>
+                <w:sz w:val="30"/>
+                <w:szCs w:val="30"/>
+              </w:rPr>
+            </w:pPr>
+            <w:r>
+              <w:rPr>
+                <w:sz w:val="30"/>
+                <w:szCs w:val="30"/>
+              </w:rPr>
+              <w:t>Can become large</w:t>
+            </w:r>
+          </w:p>
+        </w:tc>
+      </w:tr>
+      <w:tr>
+        <w:trPr>
+          <w:tblCellSpacing w:w="15" w:type="dxa"/>
+        </w:trPr>
+        <w:tc>
+          <w:tcPr>
+            <w:tcW w:w="0" w:type="auto"/>
+            <w:vAlign w:val="center"/>
+            <w:hideMark/>
+          </w:tcPr>
+          <w:p>
+            <w:pPr>
+              <w:rPr>
+                <w:sz w:val="30"/>
+                <w:szCs w:val="30"/>
+              </w:rPr>
+            </w:pPr>
+            <w:r>
+              <w:rPr>
+                <w:b/>
+                <w:bCs/>
+                <w:sz w:val="30"/>
+                <w:szCs w:val="30"/>
+              </w:rPr>
+              <w:t>Circuit Breaker</w:t>
+            </w:r>
+          </w:p>
+        </w:tc>
+        <w:tc>
+          <w:tcPr>
+            <w:tcW w:w="0" w:type="auto"/>
+            <w:vAlign w:val="center"/>
+            <w:hideMark/>
+          </w:tcPr>
+          <w:p>
+            <w:pPr>
+              <w:rPr>
+                <w:sz w:val="30"/>
+                <w:szCs w:val="30"/>
+              </w:rPr>
+            </w:pPr>
+            <w:r>
+              <w:rPr>
+                <w:sz w:val="30"/>
+                <w:szCs w:val="30"/>
+              </w:rPr>
+              <w:t>External service failure</w:t>
+            </w:r>
+          </w:p>
+        </w:tc>
+        <w:tc>
+          <w:tcPr>
+            <w:tcW w:w="0" w:type="auto"/>
+            <w:vAlign w:val="center"/>
+            <w:hideMark/>
+          </w:tcPr>
+          <w:p>
+            <w:pPr>
+              <w:rPr>
+                <w:sz w:val="30"/>
+                <w:szCs w:val="30"/>
+              </w:rPr>
+            </w:pPr>
+            <w:r>
+              <w:rPr>
+                <w:sz w:val="30"/>
+                <w:szCs w:val="30"/>
+              </w:rPr>
+              <w:t>Payment</w:t>
+            </w:r>
+          </w:p>
+        </w:tc>
+        <w:tc>
+          <w:tcPr>
+            <w:tcW w:w="0" w:type="auto"/>
+            <w:vAlign w:val="center"/>
+            <w:hideMark/>
+          </w:tcPr>
+          <w:p>
+            <w:pPr>
+              <w:rPr>
+                <w:sz w:val="30"/>
+                <w:szCs w:val="30"/>
+              </w:rPr>
+            </w:pPr>
+            <w:r>
+              <w:rPr>
+                <w:sz w:val="30"/>
+                <w:szCs w:val="30"/>
+              </w:rPr>
+              <w:t>Improves resilience</w:t>
+            </w:r>
+          </w:p>
+        </w:tc>
+        <w:tc>
+          <w:tcPr>
+            <w:tcW w:w="0" w:type="auto"/>
+            <w:vAlign w:val="center"/>
+            <w:hideMark/>
+          </w:tcPr>
+          <w:p>
+            <w:pPr>
+              <w:rPr>
+                <w:sz w:val="30"/>
+                <w:szCs w:val="30"/>
+              </w:rPr>
+            </w:pPr>
+            <w:r>
+              <w:rPr>
+                <w:sz w:val="30"/>
+                <w:szCs w:val="30"/>
+              </w:rPr>
+              <w:t>More configuration</w:t>
+            </w:r>
+          </w:p>
+        </w:tc>
+      </w:tr>
+    </w:tbl>
+    <w:p>
+      <w:pPr>
+        <w:rPr>
+          <w:sz w:val="30"/>
+          <w:szCs w:val="30"/>
+        </w:rPr>
+      </w:pPr>
+    </w:p>
+    <w:p>
+      <w:pPr>
+        <w:rPr>
+          <w:sz w:val="30"/>
+          <w:szCs w:val="30"/>
+        </w:rPr>
+      </w:pPr>
+    </w:p>
     <w:sectPr>
       <w:pgSz w:w="16838" w:h="11906" w:orient="landscape"/>
-      <w:pgMar w:top="1440" w:right="1440" w:bottom="1440" w:left="1440" w:header="708" w:footer="708" w:gutter="0"/>
+      <w:pgMar w:top="720" w:right="720" w:bottom="720" w:left="720" w:header="708" w:footer="708" w:gutter="0"/>
       <w:cols w:space="708"/>
       <w:docGrid w:linePitch="360"/>
     </w:sectPr>
@@ -2561,6 +5042,155 @@
     </w:lvl>
   </w:abstractNum>
   <w:abstractNum w:abstractNumId="4" w15:restartNumberingAfterBreak="0">
+    <w:nsid w:val="3C7E79C8"/>
+    <w:multiLevelType w:val="multilevel"/>
+    <w:tmpl w:val="73109DBE"/>
+    <w:lvl w:ilvl="0">
+      <w:start w:val="1"/>
+      <w:numFmt w:val="bullet"/>
+      <w:lvlText w:val=""/>
+      <w:lvlJc w:val="left"/>
+      <w:pPr>
+        <w:tabs>
+          <w:tab w:val="num" w:pos="720"/>
+        </w:tabs>
+        <w:ind w:left="720" w:hanging="360"/>
+      </w:pPr>
+      <w:rPr>
+        <w:rFonts w:ascii="Symbol" w:hAnsi="Symbol" w:hint="default"/>
+        <w:sz w:val="20"/>
+      </w:rPr>
+    </w:lvl>
+    <w:lvl w:ilvl="1" w:tentative="1">
+      <w:start w:val="1"/>
+      <w:numFmt w:val="bullet"/>
+      <w:lvlText w:val="o"/>
+      <w:lvlJc w:val="left"/>
+      <w:pPr>
+        <w:tabs>
+          <w:tab w:val="num" w:pos="1440"/>
+        </w:tabs>
+        <w:ind w:left="1440" w:hanging="360"/>
+      </w:pPr>
+      <w:rPr>
+        <w:rFonts w:ascii="Courier New" w:hAnsi="Courier New" w:hint="default"/>
+        <w:sz w:val="20"/>
+      </w:rPr>
+    </w:lvl>
+    <w:lvl w:ilvl="2" w:tentative="1">
+      <w:start w:val="1"/>
+      <w:numFmt w:val="bullet"/>
+      <w:lvlText w:val=""/>
+      <w:lvlJc w:val="left"/>
+      <w:pPr>
+        <w:tabs>
+          <w:tab w:val="num" w:pos="2160"/>
+        </w:tabs>
+        <w:ind w:left="2160" w:hanging="360"/>
+      </w:pPr>
+      <w:rPr>
+        <w:rFonts w:ascii="Wingdings" w:hAnsi="Wingdings" w:hint="default"/>
+        <w:sz w:val="20"/>
+      </w:rPr>
+    </w:lvl>
+    <w:lvl w:ilvl="3" w:tentative="1">
+      <w:start w:val="1"/>
+      <w:numFmt w:val="bullet"/>
+      <w:lvlText w:val=""/>
+      <w:lvlJc w:val="left"/>
+      <w:pPr>
+        <w:tabs>
+          <w:tab w:val="num" w:pos="2880"/>
+        </w:tabs>
+        <w:ind w:left="2880" w:hanging="360"/>
+      </w:pPr>
+      <w:rPr>
+        <w:rFonts w:ascii="Wingdings" w:hAnsi="Wingdings" w:hint="default"/>
+        <w:sz w:val="20"/>
+      </w:rPr>
+    </w:lvl>
+    <w:lvl w:ilvl="4" w:tentative="1">
+      <w:start w:val="1"/>
+      <w:numFmt w:val="bullet"/>
+      <w:lvlText w:val=""/>
+      <w:lvlJc w:val="left"/>
+      <w:pPr>
+        <w:tabs>
+          <w:tab w:val="num" w:pos="3600"/>
+        </w:tabs>
+        <w:ind w:left="3600" w:hanging="360"/>
+      </w:pPr>
+      <w:rPr>
+        <w:rFonts w:ascii="Wingdings" w:hAnsi="Wingdings" w:hint="default"/>
+        <w:sz w:val="20"/>
+      </w:rPr>
+    </w:lvl>
+    <w:lvl w:ilvl="5" w:tentative="1">
+      <w:start w:val="1"/>
+      <w:numFmt w:val="bullet"/>
+      <w:lvlText w:val=""/>
+      <w:lvlJc w:val="left"/>
+      <w:pPr>
+        <w:tabs>
+          <w:tab w:val="num" w:pos="4320"/>
+        </w:tabs>
+        <w:ind w:left="4320" w:hanging="360"/>
+      </w:pPr>
+      <w:rPr>
+        <w:rFonts w:ascii="Wingdings" w:hAnsi="Wingdings" w:hint="default"/>
+        <w:sz w:val="20"/>
+      </w:rPr>
+    </w:lvl>
+    <w:lvl w:ilvl="6" w:tentative="1">
+      <w:start w:val="1"/>
+      <w:numFmt w:val="bullet"/>
+      <w:lvlText w:val=""/>
+      <w:lvlJc w:val="left"/>
+      <w:pPr>
+        <w:tabs>
+          <w:tab w:val="num" w:pos="5040"/>
+        </w:tabs>
+        <w:ind w:left="5040" w:hanging="360"/>
+      </w:pPr>
+      <w:rPr>
+        <w:rFonts w:ascii="Wingdings" w:hAnsi="Wingdings" w:hint="default"/>
+        <w:sz w:val="20"/>
+      </w:rPr>
+    </w:lvl>
+    <w:lvl w:ilvl="7" w:tentative="1">
+      <w:start w:val="1"/>
+      <w:numFmt w:val="bullet"/>
+      <w:lvlText w:val=""/>
+      <w:lvlJc w:val="left"/>
+      <w:pPr>
+        <w:tabs>
+          <w:tab w:val="num" w:pos="5760"/>
+        </w:tabs>
+        <w:ind w:left="5760" w:hanging="360"/>
+      </w:pPr>
+      <w:rPr>
+        <w:rFonts w:ascii="Wingdings" w:hAnsi="Wingdings" w:hint="default"/>
+        <w:sz w:val="20"/>
+      </w:rPr>
+    </w:lvl>
+    <w:lvl w:ilvl="8" w:tentative="1">
+      <w:start w:val="1"/>
+      <w:numFmt w:val="bullet"/>
+      <w:lvlText w:val=""/>
+      <w:lvlJc w:val="left"/>
+      <w:pPr>
+        <w:tabs>
+          <w:tab w:val="num" w:pos="6480"/>
+        </w:tabs>
+        <w:ind w:left="6480" w:hanging="360"/>
+      </w:pPr>
+      <w:rPr>
+        <w:rFonts w:ascii="Wingdings" w:hAnsi="Wingdings" w:hint="default"/>
+        <w:sz w:val="20"/>
+      </w:rPr>
+    </w:lvl>
+  </w:abstractNum>
+  <w:abstractNum w:abstractNumId="5" w15:restartNumberingAfterBreak="0">
     <w:nsid w:val="47136888"/>
     <w:multiLevelType w:val="hybridMultilevel"/>
     <w:tmpl w:val="85104F40"/>
@@ -2649,7 +5279,7 @@
       </w:pPr>
     </w:lvl>
   </w:abstractNum>
-  <w:abstractNum w:abstractNumId="5" w15:restartNumberingAfterBreak="0">
+  <w:abstractNum w:abstractNumId="6" w15:restartNumberingAfterBreak="0">
     <w:nsid w:val="4D5B57D9"/>
     <w:multiLevelType w:val="multilevel"/>
     <w:tmpl w:val="F510312A"/>
@@ -2798,7 +5428,7 @@
       </w:rPr>
     </w:lvl>
   </w:abstractNum>
-  <w:abstractNum w:abstractNumId="6" w15:restartNumberingAfterBreak="0">
+  <w:abstractNum w:abstractNumId="7" w15:restartNumberingAfterBreak="0">
     <w:nsid w:val="58E21C03"/>
     <w:multiLevelType w:val="multilevel"/>
     <w:tmpl w:val="CC28D810"/>
@@ -2947,10 +5577,10 @@
       </w:rPr>
     </w:lvl>
   </w:abstractNum>
-  <w:abstractNum w:abstractNumId="7" w15:restartNumberingAfterBreak="0">
+  <w:abstractNum w:abstractNumId="8" w15:restartNumberingAfterBreak="0">
     <w:nsid w:val="7BB223C8"/>
     <w:multiLevelType w:val="multilevel"/>
-    <w:tmpl w:val="E460BBE6"/>
+    <w:tmpl w:val="188404DC"/>
     <w:lvl w:ilvl="0">
       <w:start w:val="1"/>
       <w:numFmt w:val="bullet"/>
@@ -2967,20 +5597,16 @@
         <w:sz w:val="20"/>
       </w:rPr>
     </w:lvl>
-    <w:lvl w:ilvl="1" w:tentative="1">
-      <w:start w:val="1"/>
-      <w:numFmt w:val="bullet"/>
-      <w:lvlText w:val="o"/>
-      <w:lvlJc w:val="left"/>
-      <w:pPr>
-        <w:tabs>
-          <w:tab w:val="num" w:pos="1440"/>
-        </w:tabs>
+    <w:lvl w:ilvl="1">
+      <w:start w:val="1"/>
+      <w:numFmt w:val="decimal"/>
+      <w:lvlText w:val="%2)"/>
+      <w:lvlJc w:val="left"/>
+      <w:pPr>
         <w:ind w:left="1440" w:hanging="360"/>
       </w:pPr>
       <w:rPr>
-        <w:rFonts w:ascii="Courier New" w:hAnsi="Courier New" w:hint="default"/>
-        <w:sz w:val="20"/>
+        <w:rFonts w:hint="default"/>
       </w:rPr>
     </w:lvl>
     <w:lvl w:ilvl="2" w:tentative="1">
@@ -3096,7 +5722,7 @@
       </w:rPr>
     </w:lvl>
   </w:abstractNum>
-  <w:abstractNum w:abstractNumId="8" w15:restartNumberingAfterBreak="0">
+  <w:abstractNum w:abstractNumId="9" w15:restartNumberingAfterBreak="0">
     <w:nsid w:val="7E706382"/>
     <w:multiLevelType w:val="multilevel"/>
     <w:tmpl w:val="70783CA8"/>
@@ -3249,16 +5875,16 @@
     <w:abstractNumId w:val="2"/>
   </w:num>
   <w:num w:numId="2" w16cid:durableId="1654413022">
-    <w:abstractNumId w:val="4"/>
+    <w:abstractNumId w:val="5"/>
   </w:num>
   <w:num w:numId="3" w16cid:durableId="775760143">
+    <w:abstractNumId w:val="7"/>
+  </w:num>
+  <w:num w:numId="4" w16cid:durableId="840855408">
     <w:abstractNumId w:val="6"/>
   </w:num>
-  <w:num w:numId="4" w16cid:durableId="840855408">
-    <w:abstractNumId w:val="5"/>
-  </w:num>
   <w:num w:numId="5" w16cid:durableId="746809808">
-    <w:abstractNumId w:val="8"/>
+    <w:abstractNumId w:val="9"/>
   </w:num>
   <w:num w:numId="6" w16cid:durableId="11492079">
     <w:abstractNumId w:val="1"/>
@@ -3267,10 +5893,13 @@
     <w:abstractNumId w:val="3"/>
   </w:num>
   <w:num w:numId="8" w16cid:durableId="262422562">
-    <w:abstractNumId w:val="7"/>
+    <w:abstractNumId w:val="8"/>
   </w:num>
   <w:num w:numId="9" w16cid:durableId="102265179">
     <w:abstractNumId w:val="0"/>
+  </w:num>
+  <w:num w:numId="10" w16cid:durableId="7829789">
+    <w:abstractNumId w:val="4"/>
   </w:num>
 </w:numbering>
 </file>
@@ -4236,6 +6865,19 @@
     <w:uiPriority w:val="99"/>
     <w:rsid w:val="00FB6746"/>
   </w:style>
+  <w:style w:type="paragraph" w:styleId="NormalWeb">
+    <w:name w:val="Normal (Web)"/>
+    <w:basedOn w:val="Normal"/>
+    <w:uiPriority w:val="99"/>
+    <w:semiHidden/>
+    <w:unhideWhenUsed/>
+    <w:rsid w:val="0047755C"/>
+    <w:rPr>
+      <w:rFonts w:ascii="Times New Roman" w:hAnsi="Times New Roman" w:cs="Times New Roman"/>
+      <w:sz w:val="24"/>
+      <w:szCs w:val="24"/>
+    </w:rPr>
+  </w:style>
 </w:styles>
 </file>
 

</xml_diff>